<commit_message>
Cesión de posición contractual apto 9840: cesionario Santiago, pago de contado
- Cedente Nicolás, cesionario Santiago (apellidos y cédula por completar).
- Cesión sin notificación ni autorización de los vendedores (facultad de la promesa).
- Constancia de que el precio de la promesa (20M) ya se pagó a los vendedores.
- Pago de contado: $10M arras + 50% a la firma de la compraventa + 50% a la escritura.

Co-Authored-By: Claude Opus 4.8 <noreply@anthropic.com>
Claude-Session: https://claude.ai/code/session_01V3nTS2cxs4zGL1pJrFeNth
</commit_message>
<xml_diff>
--- a/flipping-02-el-tirol-3-apto-9840/Cesion-Posicion-Contractual-9840-DEFINITIVO.docx
+++ b/flipping-02-el-tirol-3-apto-9840/Cesion-Posicion-Contractual-9840-DEFINITIVO.docx
@@ -96,7 +96,7 @@
         <w:t>promitente comprador</w:t>
       </w:r>
       <w:r>
-        <w:t xml:space="preserve"> en la promesa que más adelante se identifica;</w:t>
+        <w:t xml:space="preserve"> en la promesa de compraventa que más adelante se identifica;</w:t>
       </w:r>
     </w:p>
     <w:p>
@@ -113,7 +113,7 @@
         <w:rPr>
           <w:b/>
         </w:rPr>
-        <w:t>[NOMBRE DEL COMPRADOR FINAL]</w:t>
+        <w:t>SANTIAGO [APELLIDOS]</w:t>
       </w:r>
       <w:r>
         <w:t>, mayor de edad, domiciliado en</w:t>
@@ -137,56 +137,6 @@
       </w:r>
       <w:r>
         <w:t>;</w:t>
-      </w:r>
-    </w:p>
-    <w:p>
-      <w:r>
-        <w:rPr>
-          <w:b/>
-        </w:rPr>
-        <w:t>LOS CONTRATANTES CEDIDOS (parte vendedora):</w:t>
-      </w:r>
-      <w:r>
-        <w:t xml:space="preserve"> </w:t>
-      </w:r>
-      <w:r>
-        <w:rPr>
-          <w:b/>
-        </w:rPr>
-        <w:t>MARTHA LUCÍA MORALES ESPINAL</w:t>
-      </w:r>
-    </w:p>
-    <w:p>
-      <w:r>
-        <w:t xml:space="preserve">(C.C. 42.677.313) y su cónyuge </w:t>
-      </w:r>
-      <w:r>
-        <w:rPr>
-          <w:b/>
-        </w:rPr>
-        <w:t>LUIS EDUARDO CHAVARRÍA CARVAJAL</w:t>
-      </w:r>
-      <w:r>
-        <w:t xml:space="preserve"> (C.C. 70.576.777),</w:t>
-      </w:r>
-    </w:p>
-    <w:p>
-      <w:r>
-        <w:t>cotitulares del inmueble por pertenecer este a la sociedad conyugal, quienes</w:t>
-      </w:r>
-    </w:p>
-    <w:p>
-      <w:r>
-        <w:t xml:space="preserve">comparecen a </w:t>
-      </w:r>
-      <w:r>
-        <w:rPr>
-          <w:b/>
-        </w:rPr>
-        <w:t>aceptar</w:t>
-      </w:r>
-      <w:r>
-        <w:t xml:space="preserve"> la presente cesión;</w:t>
       </w:r>
     </w:p>
     <w:p>
@@ -216,12 +166,37 @@
         <w:t>PRIMERA. ANTECEDENTES.</w:t>
       </w:r>
       <w:r>
-        <w:t xml:space="preserve"> Entre LOS CONTRATANTES CEDIDOS (vendedores) y EL CEDENTE</w:t>
+        <w:t xml:space="preserve"> Entre la parte vendedora —</w:t>
+      </w:r>
+      <w:r>
+        <w:rPr>
+          <w:b/>
+        </w:rPr>
+        <w:t>MARTHA LUCÍA MORALES ESPINAL</w:t>
       </w:r>
     </w:p>
     <w:p>
       <w:r>
-        <w:t xml:space="preserve">(comprador) se suscribió </w:t>
+        <w:t xml:space="preserve">(C.C. 42.677.313) y su cónyuge </w:t>
+      </w:r>
+      <w:r>
+        <w:rPr>
+          <w:b/>
+        </w:rPr>
+        <w:t>LUIS EDUARDO CHAVARRÍA CARVAJAL</w:t>
+      </w:r>
+      <w:r>
+        <w:t xml:space="preserve"> (C.C. 70.576.777),</w:t>
+      </w:r>
+    </w:p>
+    <w:p>
+      <w:r>
+        <w:t>por pertenecer el inmueble a la sociedad conyugal— y EL CEDENTE (como promitente</w:t>
+      </w:r>
+    </w:p>
+    <w:p>
+      <w:r>
+        <w:t xml:space="preserve">comprador) se suscribió </w:t>
       </w:r>
       <w:r>
         <w:rPr>
@@ -280,7 +255,69 @@
         <w:rPr>
           <w:b/>
         </w:rPr>
-        <w:t>SEGUNDA. OBJETO — CESIÓN.</w:t>
+        <w:t>SEGUNDA. FACULTAD DE CEDER (SIN NOTIFICACIÓN NI AUTORIZACIÓN).</w:t>
+      </w:r>
+      <w:r>
+        <w:t xml:space="preserve"> La citada promesa</w:t>
+      </w:r>
+    </w:p>
+    <w:p>
+      <w:r>
+        <w:rPr>
+          <w:b/>
+        </w:rPr>
+        <w:t>faculta expresamente a EL CEDENTE para ceder su posición contractual</w:t>
+      </w:r>
+      <w:r>
+        <w:t>, designar un</w:t>
+      </w:r>
+    </w:p>
+    <w:p>
+      <w:r>
+        <w:t>tercero y/o disponer que la escritura se otorgue a favor de quien él indique, **sin</w:t>
+      </w:r>
+    </w:p>
+    <w:p>
+      <w:r>
+        <w:t>necesidad de aviso previo ni de autorización de la parte vendedora** (cláusula</w:t>
+      </w:r>
+    </w:p>
+    <w:p>
+      <w:r>
+        <w:rPr>
+          <w:b/>
+        </w:rPr>
+        <w:t>[__]</w:t>
+      </w:r>
+      <w:r>
+        <w:t xml:space="preserve"> de la promesa del 21 de agosto de 2026). En virtud de dicha estipulación, la</w:t>
+      </w:r>
+    </w:p>
+    <w:p>
+      <w:r>
+        <w:t xml:space="preserve">presente cesión </w:t>
+      </w:r>
+      <w:r>
+        <w:rPr>
+          <w:b/>
+        </w:rPr>
+        <w:t>no requiere la comparecencia, notificación ni consentimiento</w:t>
+      </w:r>
+      <w:r>
+        <w:t xml:space="preserve"> de</w:t>
+      </w:r>
+    </w:p>
+    <w:p>
+      <w:r>
+        <w:t>los contratantes cedidos (vendedores).</w:t>
+      </w:r>
+    </w:p>
+    <w:p>
+      <w:r>
+        <w:rPr>
+          <w:b/>
+        </w:rPr>
+        <w:t>TERCERA. OBJETO — CESIÓN.</w:t>
       </w:r>
       <w:r>
         <w:t xml:space="preserve"> EL CEDENTE **cede la totalidad de su posición</w:t>
@@ -302,26 +339,17 @@
         <w:t>subroga</w:t>
       </w:r>
       <w:r>
-        <w:t xml:space="preserve"> en todos sus derechos y obligaciones.</w:t>
+        <w:t xml:space="preserve"> en todos los derechos y obligaciones del</w:t>
       </w:r>
     </w:p>
     <w:p>
       <w:r>
-        <w:t xml:space="preserve">En consecuencia, la </w:t>
-      </w:r>
-      <w:r>
-        <w:rPr>
-          <w:b/>
-        </w:rPr>
-        <w:t>escritura pública de compraventa se otorgará directamente</w:t>
-      </w:r>
-      <w:r>
-        <w:t xml:space="preserve"> por</w:t>
+        <w:t>promitente comprador. En consecuencia, la **escritura pública de compraventa se</w:t>
       </w:r>
     </w:p>
     <w:p>
       <w:r>
-        <w:t>LOS CONTRATANTES CEDIDOS (vendedores) a favor de EL CESIONARIO.</w:t>
+        <w:t>otorgará directamente** por los vendedores a favor de EL CESIONARIO.</w:t>
       </w:r>
     </w:p>
     <w:p>
@@ -329,43 +357,144 @@
         <w:rPr>
           <w:b/>
         </w:rPr>
-        <w:t>TERCERA. PRECIO DE LA CESIÓN.</w:t>
+        <w:t>CUARTA. PRECIO DE LA CESIÓN Y FORMA DE PAGO.</w:t>
       </w:r>
       <w:r>
-        <w:t xml:space="preserve"> EL CESIONARIO pagará a EL CEDENTE, por esta cesión,</w:t>
+        <w:t xml:space="preserve"> EL CESIONARIO pagará a EL CEDENTE,</w:t>
       </w:r>
     </w:p>
     <w:p>
       <w:r>
-        <w:t xml:space="preserve">la suma de </w:t>
+        <w:t xml:space="preserve">por esta cesión, la suma de </w:t>
       </w:r>
       <w:r>
         <w:rPr>
           <w:b/>
         </w:rPr>
-        <w:t>$[__________]</w:t>
+        <w:t>$[__________ — TOTAL POR CONFIRMAR]</w:t>
       </w:r>
       <w:r>
-        <w:t xml:space="preserve"> M/CTE, así: </w:t>
+        <w:t xml:space="preserve"> M/CTE, que se</w:t>
+      </w:r>
+    </w:p>
+    <w:p>
+      <w:r>
+        <w:t xml:space="preserve">cancelará </w:t>
       </w:r>
       <w:r>
         <w:rPr>
           <w:b/>
         </w:rPr>
-        <w:t>[forma de pago]</w:t>
+        <w:t>de contado</w:t>
       </w:r>
       <w:r>
-        <w:t>. *(Este valor refleja el</w:t>
+        <w:t xml:space="preserve"> así:</w:t>
+      </w:r>
+    </w:p>
+    <w:p>
+      <w:pPr>
+        <w:pStyle w:val="ListNumber"/>
+      </w:pPr>
+      <w:r>
+        <w:rPr>
+          <w:b/>
+        </w:rPr>
+        <w:t>$10.000.000</w:t>
+      </w:r>
+      <w:r>
+        <w:t xml:space="preserve"> M/CTE a título de </w:t>
+      </w:r>
+      <w:r>
+        <w:rPr>
+          <w:b/>
+        </w:rPr>
+        <w:t>arras / cuota inicial</w:t>
+      </w:r>
+      <w:r>
+        <w:t>, imputables al precio,</w:t>
       </w:r>
     </w:p>
     <w:p>
       <w:r>
-        <w:t>reembolso de lo que EL CEDENTE pagó a los vendedores más la valorización/remodelación</w:t>
+        <w:t xml:space="preserve">   que EL CESIONARIO entrega a EL CEDENTE </w:t>
+      </w:r>
+      <w:r>
+        <w:rPr>
+          <w:b/>
+        </w:rPr>
+        <w:t>a la firma del presente contrato</w:t>
+      </w:r>
+      <w:r>
+        <w:t>.</w:t>
+      </w:r>
+    </w:p>
+    <w:p>
+      <w:pPr>
+        <w:pStyle w:val="ListNumber"/>
+      </w:pPr>
+      <w:r>
+        <w:t xml:space="preserve">El </w:t>
+      </w:r>
+      <w:r>
+        <w:rPr>
+          <w:b/>
+        </w:rPr>
+        <w:t>cincuenta por ciento (50%)</w:t>
+      </w:r>
+      <w:r>
+        <w:t xml:space="preserve"> del precio, **a la firma de la escritura pública</w:t>
       </w:r>
     </w:p>
     <w:p>
       <w:r>
-        <w:t>y su margen.)*</w:t>
+        <w:t xml:space="preserve">   de compraventa</w:t>
+      </w:r>
+      <w:r>
+        <w:rPr>
+          <w:b/>
+        </w:rPr>
+        <w:t xml:space="preserve"> *(promesa/compraventa de cesión)* </w:t>
+      </w:r>
+      <w:r>
+        <w:t>[precisar hito]**.</w:t>
+      </w:r>
+    </w:p>
+    <w:p>
+      <w:pPr>
+        <w:pStyle w:val="ListNumber"/>
+      </w:pPr>
+      <w:r>
+        <w:t xml:space="preserve">El </w:t>
+      </w:r>
+      <w:r>
+        <w:rPr>
+          <w:b/>
+        </w:rPr>
+        <w:t>cincuenta por ciento (50%)</w:t>
+      </w:r>
+      <w:r>
+        <w:t xml:space="preserve"> restante, </w:t>
+      </w:r>
+      <w:r>
+        <w:rPr>
+          <w:b/>
+        </w:rPr>
+        <w:t>a la firma de la Escritura Pública</w:t>
+      </w:r>
+    </w:p>
+    <w:p>
+      <w:r>
+        <w:t xml:space="preserve">   de compraventa en la notaría.</w:t>
+      </w:r>
+    </w:p>
+    <w:p>
+      <w:r>
+        <w:t>*(Este valor refleja el reembolso de lo que EL CEDENTE pagó a los vendedores más la</w:t>
+      </w:r>
+    </w:p>
+    <w:p>
+      <w:r>
+        <w:t>valorización/remodelación y su margen, y constituye ingreso gravado de EL CEDENTE.)*</w:t>
       </w:r>
     </w:p>
     <w:p>
@@ -373,74 +502,48 @@
         <w:rPr>
           <w:b/>
         </w:rPr>
-        <w:t>CUARTA. ESTADO DEL PRECIO DE LA PROMESA.</w:t>
+        <w:t>QUINTA. ESTADO DEL PRECIO DE LA PROMESA.</w:t>
       </w:r>
       <w:r>
-        <w:t xml:space="preserve"> Las partes dejan constancia de que, del</w:t>
+        <w:t xml:space="preserve"> Las partes dejan constancia de que EL</w:t>
       </w:r>
     </w:p>
     <w:p>
       <w:r>
-        <w:t>precio de la promesa ($120.000.000), EL CEDENTE **ya pagó a los vendedores la suma de</w:t>
+        <w:t>CEDENTE **ya pagó en su totalidad a los vendedores el precio de la promesa</w:t>
       </w:r>
     </w:p>
     <w:p>
       <w:r>
-        <w:t>$[__________]</w:t>
+        <w:t>($120.000.000)</w:t>
       </w:r>
       <w:r>
         <w:rPr>
           <w:b/>
         </w:rPr>
-        <w:t xml:space="preserve">. El saldo pendiente a favor de los vendedores, de </w:t>
+        <w:t xml:space="preserve">, por lo que </w:t>
       </w:r>
       <w:r>
-        <w:t>$[__________]**,</w:t>
+        <w:t>no queda saldo pendiente a favor de los vendedores**.</w:t>
       </w:r>
     </w:p>
     <w:p>
       <w:r>
-        <w:t>será **[asumido por EL CESIONARIO y pagado a la firma de la escritura / ya fue pagado</w:t>
-      </w:r>
-    </w:p>
-    <w:p>
-      <w:r>
-        <w:t>por EL CEDENTE]**.</w:t>
-      </w:r>
-    </w:p>
-    <w:p>
-      <w:r>
-        <w:rPr>
-          <w:b/>
-        </w:rPr>
-        <w:t>QUINTA. ACEPTACIÓN DE LOS CEDIDOS.</w:t>
-      </w:r>
-      <w:r>
-        <w:t xml:space="preserve"> LOS CONTRATANTES CEDIDOS </w:t>
+        <w:t xml:space="preserve">En consecuencia, el único pago pendiente es el </w:t>
       </w:r>
       <w:r>
         <w:rPr>
           <w:b/>
         </w:rPr>
-        <w:t>aceptan</w:t>
+        <w:t>precio de la cesión</w:t>
       </w:r>
       <w:r>
-        <w:t xml:space="preserve"> la cesión</w:t>
+        <w:t xml:space="preserve"> pactado en la</w:t>
       </w:r>
     </w:p>
     <w:p>
       <w:r>
-        <w:t>y se obligan a otorgar la escritura de compraventa directamente a favor de EL</w:t>
-      </w:r>
-    </w:p>
-    <w:p>
-      <w:r>
-        <w:t>CESIONARIO, en los términos de la promesa, manteniéndose el precio, plazos y</w:t>
-      </w:r>
-    </w:p>
-    <w:p>
-      <w:r>
-        <w:t>condiciones pactados.</w:t>
+        <w:t>cláusula CUARTA, a cargo de EL CESIONARIO y a favor de EL CEDENTE.</w:t>
       </w:r>
     </w:p>
     <w:p>
@@ -479,12 +582,12 @@
     </w:p>
     <w:p>
       <w:r>
-        <w:t>Patrimonio de Familia (anot. 009), el levantamiento de la Afectación a Vivienda</w:t>
+        <w:t>Patrimonio de Familia, el levantamiento de la Afectación a Vivienda Familiar (con</w:t>
       </w:r>
     </w:p>
     <w:p>
       <w:r>
-        <w:t xml:space="preserve">Familiar (anot. 010, con Martha y Luis Eduardo) y el </w:t>
+        <w:t xml:space="preserve">Martha y Luis Eduardo) y el </w:t>
       </w:r>
       <w:r>
         <w:rPr>
@@ -492,10 +595,18 @@
         </w:rPr>
         <w:t>retiro registrado de ISVIMED</w:t>
       </w:r>
+      <w:r>
+        <w:t xml:space="preserve"> (prohibición de</w:t>
+      </w:r>
     </w:p>
     <w:p>
       <w:r>
-        <w:t>(anot. 007/008, Ley 1537 de 2012).</w:t>
+        <w:t>transferencia y derecho de preferencia, Ley 1537 de 2012). El saneamiento está a cargo</w:t>
+      </w:r>
+    </w:p>
+    <w:p>
+      <w:r>
+        <w:t>de la parte vendedora en los términos de la promesa.</w:t>
       </w:r>
     </w:p>
     <w:p>
@@ -540,12 +651,12 @@
         <w:t>[o a más tardar el [__] de [____] de 202_]</w:t>
       </w:r>
       <w:r>
-        <w:t>. *(Si EL CESIONARIO compra con crédito</w:t>
+        <w:t>. EL CEDENTE y/o EL CESIONARIO</w:t>
       </w:r>
     </w:p>
     <w:p>
       <w:r>
-        <w:t>—banco o FNA— se ajustarán los tiempos y se constituirá hipoteca en el mismo acto.)*</w:t>
+        <w:t>coordinarán con la parte vendedora la firma de la escritura a favor de EL CESIONARIO.</w:t>
       </w:r>
     </w:p>
     <w:p>
@@ -556,12 +667,17 @@
         <w:t>OCTAVA. DECLARACIONES.</w:t>
       </w:r>
       <w:r>
-        <w:t xml:space="preserve"> EL CEDENTE declara estar al día en sus obligaciones de la</w:t>
+        <w:t xml:space="preserve"> EL CEDENTE declara estar al día en sus obligaciones frente</w:t>
       </w:r>
     </w:p>
     <w:p>
       <w:r>
-        <w:t xml:space="preserve">promesa. Las partes reconocen el carácter </w:t>
+        <w:t>a la promesa (incluido el pago íntegro del precio a los vendedores). Las partes</w:t>
+      </w:r>
+    </w:p>
+    <w:p>
+      <w:r>
+        <w:t xml:space="preserve">reconocen el carácter </w:t>
       </w:r>
       <w:r>
         <w:rPr>
@@ -570,12 +686,12 @@
         <w:t>gravado</w:t>
       </w:r>
       <w:r>
-        <w:t xml:space="preserve"> del ingreso por la cesión y que</w:t>
+        <w:t xml:space="preserve"> del ingreso por la cesión y que cada una asume sus</w:t>
       </w:r>
     </w:p>
     <w:p>
       <w:r>
-        <w:t>cada una asume sus obligaciones tributarias.</w:t>
+        <w:t>obligaciones tributarias.</w:t>
       </w:r>
     </w:p>
     <w:p>
@@ -586,13 +702,17 @@
         <w:t>NOVENA. GASTOS.</w:t>
       </w:r>
       <w:r>
-        <w:t xml:space="preserve"> </w:t>
+        <w:t xml:space="preserve"> **[Definir: notariales, registro, impuesto de registro, etc. —</w:t>
       </w:r>
+    </w:p>
+    <w:p>
       <w:r>
-        <w:rPr>
-          <w:b/>
-        </w:rPr>
-        <w:t>[Definir: notariales, registro, impuesto de registro, etc.]</w:t>
+        <w:t>sugerencia: notariales 50/50; registro y beneficencia por EL CESIONARIO; retención en</w:t>
+      </w:r>
+    </w:p>
+    <w:p>
+      <w:r>
+        <w:t>la fuente de la cesión según corresponda a EL CEDENTE].**</w:t>
       </w:r>
     </w:p>
     <w:p>
@@ -623,7 +743,7 @@
         <w:rPr>
           <w:b/>
         </w:rPr>
-        <w:t>[tres/cuatro]</w:t>
+        <w:t>[dos]</w:t>
       </w:r>
       <w:r>
         <w:t xml:space="preserve"> ejemplares.</w:t>
@@ -641,32 +761,12 @@
     </w:p>
     <w:p>
       <w:r>
-        <w:t>NICOLÁS MEJÍA ACEVEDO                         [NOMBRE] — C.C. [__________]</w:t>
+        <w:t>NICOLÁS MEJÍA ACEVEDO                         SANTIAGO [APELLIDOS]</w:t>
       </w:r>
     </w:p>
     <w:p>
       <w:r>
-        <w:t>C.C. 1.028.031.225</w:t>
-      </w:r>
-    </w:p>
-    <w:p>
-      <w:r>
-        <w:t>LOS CONTRATANTES CEDIDOS (aceptan):</w:t>
-      </w:r>
-    </w:p>
-    <w:p>
-      <w:r>
-        <w:t>_____________________________                _____________________________</w:t>
-      </w:r>
-    </w:p>
-    <w:p>
-      <w:r>
-        <w:t>MARTHA LUCÍA MORALES ESPINAL                  LUIS EDUARDO CHAVARRÍA CARVAJAL</w:t>
-      </w:r>
-    </w:p>
-    <w:p>
-      <w:r>
-        <w:t>C.C. 42.677.313                               C.C. 70.576.777</w:t>
+        <w:t>C.C. 1.028.031.225                            C.C. [__________]</w:t>
       </w:r>
     </w:p>
     <w:sectPr>

</xml_diff>

<commit_message>
Cesión apto 9840: datos de Simón Angulo, precio $155M (10M arras + 50/50)
Co-Authored-By: Claude Opus 4.8 <noreply@anthropic.com>
Claude-Session: https://claude.ai/code/session_01V3nTS2cxs4zGL1pJrFeNth
</commit_message>
<xml_diff>
--- a/flipping-02-el-tirol-3-apto-9840/Cesion-Posicion-Contractual-9840-DEFINITIVO.docx
+++ b/flipping-02-el-tirol-3-apto-9840/Cesion-Posicion-Contractual-9840-DEFINITIVO.docx
@@ -113,7 +113,7 @@
         <w:rPr>
           <w:b/>
         </w:rPr>
-        <w:t>SANTIAGO [APELLIDOS]</w:t>
+        <w:t>SIMÓN ANGULO RAMÍREZ</w:t>
       </w:r>
       <w:r>
         <w:t>, mayor de edad, domiciliado en</w:t>
@@ -133,7 +133,7 @@
         <w:rPr>
           <w:b/>
         </w:rPr>
-        <w:t>[__________]</w:t>
+        <w:t>1.023.527.392</w:t>
       </w:r>
       <w:r>
         <w:t>;</w:t>
@@ -365,67 +365,21 @@
     </w:p>
     <w:p>
       <w:r>
-        <w:t xml:space="preserve">por esta cesión, la suma de </w:t>
+        <w:t>por esta cesión, la suma de **CIENTO CINCUENTA Y CINCO MILLONES DE PESOS M/CTE</w:t>
+      </w:r>
+    </w:p>
+    <w:p>
+      <w:r>
+        <w:t>($155.000.000)</w:t>
       </w:r>
       <w:r>
         <w:rPr>
           <w:b/>
         </w:rPr>
-        <w:t>$[__________ — TOTAL POR CONFIRMAR]</w:t>
+        <w:t xml:space="preserve">, que se cancelará </w:t>
       </w:r>
       <w:r>
-        <w:t xml:space="preserve"> M/CTE, que se</w:t>
-      </w:r>
-    </w:p>
-    <w:p>
-      <w:r>
-        <w:t xml:space="preserve">cancelará </w:t>
-      </w:r>
-      <w:r>
-        <w:rPr>
-          <w:b/>
-        </w:rPr>
-        <w:t>de contado</w:t>
-      </w:r>
-      <w:r>
-        <w:t xml:space="preserve"> así:</w:t>
-      </w:r>
-    </w:p>
-    <w:p>
-      <w:pPr>
-        <w:pStyle w:val="ListNumber"/>
-      </w:pPr>
-      <w:r>
-        <w:rPr>
-          <w:b/>
-        </w:rPr>
-        <w:t>$10.000.000</w:t>
-      </w:r>
-      <w:r>
-        <w:t xml:space="preserve"> M/CTE a título de </w:t>
-      </w:r>
-      <w:r>
-        <w:rPr>
-          <w:b/>
-        </w:rPr>
-        <w:t>arras / cuota inicial</w:t>
-      </w:r>
-      <w:r>
-        <w:t>, imputables al precio,</w:t>
-      </w:r>
-    </w:p>
-    <w:p>
-      <w:r>
-        <w:t xml:space="preserve">   que EL CESIONARIO entrega a EL CEDENTE </w:t>
-      </w:r>
-      <w:r>
-        <w:rPr>
-          <w:b/>
-        </w:rPr>
-        <w:t>a la firma del presente contrato</w:t>
-      </w:r>
-      <w:r>
-        <w:t>.</w:t>
+        <w:t>de contado** así:</w:t>
       </w:r>
     </w:p>
     <w:p>
@@ -439,24 +393,52 @@
         <w:rPr>
           <w:b/>
         </w:rPr>
-        <w:t>cincuenta por ciento (50%)</w:t>
+        <w:t>cincuenta por ciento (50%) — $77.500.000</w:t>
       </w:r>
       <w:r>
-        <w:t xml:space="preserve"> del precio, **a la firma de la escritura pública</w:t>
+        <w:t xml:space="preserve"> M/CTE **a la firma del presente</w:t>
       </w:r>
     </w:p>
     <w:p>
       <w:r>
-        <w:t xml:space="preserve">   de compraventa</w:t>
+        <w:t xml:space="preserve">   contrato de cesión (compraventa de la posición contractual)**. De esta suma,</w:t>
+      </w:r>
+    </w:p>
+    <w:p>
+      <w:r>
+        <w:t xml:space="preserve">   </w:t>
       </w:r>
       <w:r>
         <w:rPr>
           <w:b/>
         </w:rPr>
-        <w:t xml:space="preserve"> *(promesa/compraventa de cesión)* </w:t>
+        <w:t>$10.000.000</w:t>
       </w:r>
       <w:r>
-        <w:t>[precisar hito]**.</w:t>
+        <w:t xml:space="preserve"> se entregan a título de </w:t>
+      </w:r>
+      <w:r>
+        <w:rPr>
+          <w:b/>
+        </w:rPr>
+        <w:t>arras imputables al precio</w:t>
+      </w:r>
+      <w:r>
+        <w:t xml:space="preserve"> y el saldo</w:t>
+      </w:r>
+    </w:p>
+    <w:p>
+      <w:r>
+        <w:t xml:space="preserve">   de </w:t>
+      </w:r>
+      <w:r>
+        <w:rPr>
+          <w:b/>
+        </w:rPr>
+        <w:t>$67.500.000</w:t>
+      </w:r>
+      <w:r>
+        <w:t xml:space="preserve"> completa el primer 50%.</w:t>
       </w:r>
     </w:p>
     <w:p>
@@ -470,21 +452,15 @@
         <w:rPr>
           <w:b/>
         </w:rPr>
-        <w:t>cincuenta por ciento (50%)</w:t>
+        <w:t>cincuenta por ciento (50%) restante — $77.500.000</w:t>
       </w:r>
       <w:r>
-        <w:t xml:space="preserve"> restante, </w:t>
-      </w:r>
-      <w:r>
-        <w:rPr>
-          <w:b/>
-        </w:rPr>
-        <w:t>a la firma de la Escritura Pública</w:t>
+        <w:t xml:space="preserve"> M/CTE **a la firma de la</w:t>
       </w:r>
     </w:p>
     <w:p>
       <w:r>
-        <w:t xml:space="preserve">   de compraventa en la notaría.</w:t>
+        <w:t xml:space="preserve">   Escritura Pública** de compraventa en la notaría.</w:t>
       </w:r>
     </w:p>
     <w:p>
@@ -761,12 +737,12 @@
     </w:p>
     <w:p>
       <w:r>
-        <w:t>NICOLÁS MEJÍA ACEVEDO                         SANTIAGO [APELLIDOS]</w:t>
+        <w:t>NICOLÁS MEJÍA ACEVEDO                         SIMÓN ANGULO RAMÍREZ</w:t>
       </w:r>
     </w:p>
     <w:p>
       <w:r>
-        <w:t>C.C. 1.028.031.225                            C.C. [__________]</w:t>
+        <w:t>C.C. 1.028.031.225                            C.C. 1.023.527.392</w:t>
       </w:r>
     </w:p>
     <w:sectPr>

</xml_diff>

<commit_message>
Cesión apto 9840 sobre $155M: fechas (3 y 12 nov) y cláusulas de protección
- Precio real $155M; $10M arras + 50% el 3-nov + 50% a la escritura (12-nov).
- Cláusula penal 20%, pérdida de arras, condición resolutoria, pago contra escritura.
- Mérito ejecutivo, medios de pago (771-5), declaración de precio real.

Co-Authored-By: Claude Opus 4.8 <noreply@anthropic.com>
Claude-Session: https://claude.ai/code/session_01V3nTS2cxs4zGL1pJrFeNth
</commit_message>
<xml_diff>
--- a/flipping-02-el-tirol-3-apto-9840/Cesion-Posicion-Contractual-9840-DEFINITIVO.docx
+++ b/flipping-02-el-tirol-3-apto-9840/Cesion-Posicion-Contractual-9840-DEFINITIVO.docx
@@ -155,7 +155,7 @@
     </w:p>
     <w:p>
       <w:r>
-        <w:t>regirá por las siguientes cláusulas:</w:t>
+        <w:t>regirá por las leyes colombianas y en especial por las siguientes cláusulas:</w:t>
       </w:r>
     </w:p>
     <w:p>
@@ -279,23 +279,26 @@
     </w:p>
     <w:p>
       <w:r>
-        <w:t>necesidad de aviso previo ni de autorización de la parte vendedora** (cláusula</w:t>
+        <w:t>necesidad de aviso previo ni de autorización de la parte vendedora</w:t>
+      </w:r>
+      <w:r>
+        <w:rPr>
+          <w:b/>
+        </w:rPr>
+        <w:t xml:space="preserve"> (cláusula </w:t>
+      </w:r>
+      <w:r>
+        <w:t>[__]**</w:t>
       </w:r>
     </w:p>
     <w:p>
       <w:r>
-        <w:rPr>
-          <w:b/>
-        </w:rPr>
-        <w:t>[__]</w:t>
-      </w:r>
-      <w:r>
-        <w:t xml:space="preserve"> de la promesa del 21 de agosto de 2026). En virtud de dicha estipulación, la</w:t>
+        <w:t>de la promesa del 21 de agosto de 2026). En virtud de dicha estipulación, la presente</w:t>
       </w:r>
     </w:p>
     <w:p>
       <w:r>
-        <w:t xml:space="preserve">presente cesión </w:t>
+        <w:t xml:space="preserve">cesión </w:t>
       </w:r>
       <w:r>
         <w:rPr>
@@ -304,12 +307,12 @@
         <w:t>no requiere la comparecencia, notificación ni consentimiento</w:t>
       </w:r>
       <w:r>
-        <w:t xml:space="preserve"> de</w:t>
+        <w:t xml:space="preserve"> de los</w:t>
       </w:r>
     </w:p>
     <w:p>
       <w:r>
-        <w:t>los contratantes cedidos (vendedores).</w:t>
+        <w:t>contratantes cedidos (vendedores).</w:t>
       </w:r>
     </w:p>
     <w:p>
@@ -370,16 +373,7 @@
     </w:p>
     <w:p>
       <w:r>
-        <w:t>($155.000.000)</w:t>
-      </w:r>
-      <w:r>
-        <w:rPr>
-          <w:b/>
-        </w:rPr>
-        <w:t xml:space="preserve">, que se cancelará </w:t>
-      </w:r>
-      <w:r>
-        <w:t>de contado** así:</w:t>
+        <w:t>($155.000.000)**, que se cancelará así:</w:t>
       </w:r>
     </w:p>
     <w:p>
@@ -387,21 +381,53 @@
         <w:pStyle w:val="ListNumber"/>
       </w:pPr>
       <w:r>
-        <w:t xml:space="preserve">El </w:t>
+        <w:rPr>
+          <w:b/>
+        </w:rPr>
+        <w:t>$10.000.000</w:t>
+      </w:r>
+      <w:r>
+        <w:t xml:space="preserve"> M/CTE a título de </w:t>
       </w:r>
       <w:r>
         <w:rPr>
           <w:b/>
         </w:rPr>
-        <w:t>cincuenta por ciento (50%) — $77.500.000</w:t>
+        <w:t>arras confirmatorias imputables al precio</w:t>
       </w:r>
       <w:r>
-        <w:t xml:space="preserve"> M/CTE **a la firma del presente</w:t>
+        <w:t xml:space="preserve"> (ver</w:t>
       </w:r>
     </w:p>
     <w:p>
       <w:r>
-        <w:t xml:space="preserve">   contrato de cesión (compraventa de la posición contractual)**. De esta suma,</w:t>
+        <w:t xml:space="preserve">   cláusula QUINTA), a la </w:t>
+      </w:r>
+      <w:r>
+        <w:rPr>
+          <w:b/>
+        </w:rPr>
+        <w:t>firma del presente contrato</w:t>
+      </w:r>
+      <w:r>
+        <w:t>.</w:t>
+      </w:r>
+    </w:p>
+    <w:p>
+      <w:pPr>
+        <w:pStyle w:val="ListNumber"/>
+      </w:pPr>
+      <w:r>
+        <w:t xml:space="preserve">Saldo hasta completar el </w:t>
+      </w:r>
+      <w:r>
+        <w:rPr>
+          <w:b/>
+        </w:rPr>
+        <w:t>primer 50% — $67.500.000</w:t>
+      </w:r>
+      <w:r>
+        <w:t xml:space="preserve"> M/CTE (para un acumulado de</w:t>
       </w:r>
     </w:p>
     <w:p>
@@ -412,33 +438,19 @@
         <w:rPr>
           <w:b/>
         </w:rPr>
-        <w:t>$10.000.000</w:t>
+        <w:t>$77.500.000</w:t>
       </w:r>
       <w:r>
-        <w:t xml:space="preserve"> se entregan a título de </w:t>
+        <w:t xml:space="preserve">), </w:t>
       </w:r>
       <w:r>
         <w:rPr>
           <w:b/>
         </w:rPr>
-        <w:t>arras imputables al precio</w:t>
+        <w:t>el 3 de noviembre de 2026</w:t>
       </w:r>
       <w:r>
-        <w:t xml:space="preserve"> y el saldo</w:t>
-      </w:r>
-    </w:p>
-    <w:p>
-      <w:r>
-        <w:t xml:space="preserve">   de </w:t>
-      </w:r>
-      <w:r>
-        <w:rPr>
-          <w:b/>
-        </w:rPr>
-        <w:t>$67.500.000</w:t>
-      </w:r>
-      <w:r>
-        <w:t xml:space="preserve"> completa el primer 50%.</w:t>
+        <w:t>.</w:t>
       </w:r>
     </w:p>
     <w:p>
@@ -446,31 +458,57 @@
         <w:pStyle w:val="ListNumber"/>
       </w:pPr>
       <w:r>
-        <w:t xml:space="preserve">El </w:t>
+        <w:rPr>
+          <w:b/>
+        </w:rPr>
+        <w:t>50% restante — $77.500.000</w:t>
+      </w:r>
+      <w:r>
+        <w:t xml:space="preserve"> M/CTE, el </w:t>
       </w:r>
       <w:r>
         <w:rPr>
           <w:b/>
         </w:rPr>
-        <w:t>cincuenta por ciento (50%) restante — $77.500.000</w:t>
-      </w:r>
-      <w:r>
-        <w:t xml:space="preserve"> M/CTE **a la firma de la</w:t>
+        <w:t>día de la firma de la Escritura Pública</w:t>
       </w:r>
     </w:p>
     <w:p>
       <w:r>
-        <w:t xml:space="preserve">   Escritura Pública** de compraventa en la notaría.</w:t>
+        <w:t xml:space="preserve">   de compraventa, previsto para el </w:t>
+      </w:r>
+      <w:r>
+        <w:rPr>
+          <w:b/>
+        </w:rPr>
+        <w:t>12 de noviembre de 2026</w:t>
+      </w:r>
+      <w:r>
+        <w:t xml:space="preserve"> (cláusula DÉCIMA).</w:t>
       </w:r>
     </w:p>
     <w:p>
       <w:r>
-        <w:t>*(Este valor refleja el reembolso de lo que EL CEDENTE pagó a los vendedores más la</w:t>
+        <w:t xml:space="preserve">PARÁGRAFO: los pagos se harán por </w:t>
+      </w:r>
+      <w:r>
+        <w:rPr>
+          <w:b/>
+        </w:rPr>
+        <w:t>transferencia o consignación</w:t>
+      </w:r>
+      <w:r>
+        <w:t xml:space="preserve"> a la cuenta que</w:t>
       </w:r>
     </w:p>
     <w:p>
       <w:r>
-        <w:t>valorización/remodelación y su margen, y constituye ingreso gravado de EL CEDENTE.)*</w:t>
+        <w:t>indique EL CEDENTE (no en efectivo), para efectos de trazabilidad y del **Art. 771-5</w:t>
+      </w:r>
+    </w:p>
+    <w:p>
+      <w:r>
+        <w:t>E.T.** (bancarización).</w:t>
       </w:r>
     </w:p>
     <w:p>
@@ -478,7 +516,65 @@
         <w:rPr>
           <w:b/>
         </w:rPr>
-        <w:t>QUINTA. ESTADO DEL PRECIO DE LA PROMESA.</w:t>
+        <w:t>QUINTA. ARRAS.</w:t>
+      </w:r>
+      <w:r>
+        <w:t xml:space="preserve"> Los $10.000.000 se entregan como **arras confirmatorias imputables</w:t>
+      </w:r>
+    </w:p>
+    <w:p>
+      <w:r>
+        <w:t>al precio</w:t>
+      </w:r>
+      <w:r>
+        <w:rPr>
+          <w:b/>
+        </w:rPr>
+        <w:t xml:space="preserve">. Si EL CESIONARIO </w:t>
+      </w:r>
+      <w:r>
+        <w:t>desiste o incumple</w:t>
+      </w:r>
+      <w:r>
+        <w:rPr>
+          <w:b/>
+        </w:rPr>
+        <w:t xml:space="preserve"> sus obligaciones de pago, </w:t>
+      </w:r>
+      <w:r>
+        <w:t>EL</w:t>
+      </w:r>
+    </w:p>
+    <w:p>
+      <w:r>
+        <w:t>CEDENTE podrá retenerlas** a título de parte de la pena (cláusula SÉPTIMA), sin</w:t>
+      </w:r>
+    </w:p>
+    <w:p>
+      <w:r>
+        <w:t>perjuicio de las demás acciones. Si el negocio no se realiza por **causa imputable a EL</w:t>
+      </w:r>
+    </w:p>
+    <w:p>
+      <w:r>
+        <w:t>CEDENTE</w:t>
+      </w:r>
+      <w:r>
+        <w:rPr>
+          <w:b/>
+        </w:rPr>
+        <w:t xml:space="preserve">, este las </w:t>
+      </w:r>
+      <w:r>
+        <w:t>restituirá** a EL CESIONARIO.</w:t>
+      </w:r>
+    </w:p>
+    <w:p>
+      <w:r>
+        <w:rPr>
+          <w:b/>
+        </w:rPr>
+        <w:t>SEXTA. ESTADO DEL PRECIO DE LA PROMESA.</w:t>
       </w:r>
       <w:r>
         <w:t xml:space="preserve"> Las partes dejan constancia de que EL</w:t>
@@ -500,12 +596,12 @@
         <w:t xml:space="preserve">, por lo que </w:t>
       </w:r>
       <w:r>
-        <w:t>no queda saldo pendiente a favor de los vendedores**.</w:t>
+        <w:t>no queda saldo pendiente a favor de los vendedores**. El</w:t>
       </w:r>
     </w:p>
     <w:p>
       <w:r>
-        <w:t xml:space="preserve">En consecuencia, el único pago pendiente es el </w:t>
+        <w:t xml:space="preserve">único pago pendiente es el </w:t>
       </w:r>
       <w:r>
         <w:rPr>
@@ -514,12 +610,12 @@
         <w:t>precio de la cesión</w:t>
       </w:r>
       <w:r>
-        <w:t xml:space="preserve"> pactado en la</w:t>
+        <w:t xml:space="preserve"> (cláusula CUARTA), a favor de EL</w:t>
       </w:r>
     </w:p>
     <w:p>
       <w:r>
-        <w:t>cláusula CUARTA, a cargo de EL CESIONARIO y a favor de EL CEDENTE.</w:t>
+        <w:t>CEDENTE.</w:t>
       </w:r>
     </w:p>
     <w:p>
@@ -527,15 +623,150 @@
         <w:rPr>
           <w:b/>
         </w:rPr>
-        <w:t>SEXTA. SANEAMIENTO DEL FOLIO (CONDICIÓN).</w:t>
+        <w:t>SÉPTIMA. CLÁUSULA PENAL.</w:t>
       </w:r>
       <w:r>
-        <w:t xml:space="preserve"> Como condición para la escritura, el</w:t>
+        <w:t xml:space="preserve"> La parte que incumpla cualquiera de las obligaciones aquí</w:t>
       </w:r>
     </w:p>
     <w:p>
       <w:r>
-        <w:t xml:space="preserve">folio deberá quedar </w:t>
+        <w:t xml:space="preserve">pactadas pagará a la otra, a título de </w:t>
+      </w:r>
+      <w:r>
+        <w:rPr>
+          <w:b/>
+        </w:rPr>
+        <w:t>pena</w:t>
+      </w:r>
+      <w:r>
+        <w:t>, una suma equivalente al **veinte por</w:t>
+      </w:r>
+    </w:p>
+    <w:p>
+      <w:r>
+        <w:t>ciento (20%) del precio de la cesión — $31.000.000**, como estimación anticipada de</w:t>
+      </w:r>
+    </w:p>
+    <w:p>
+      <w:r>
+        <w:t xml:space="preserve">perjuicios. Conforme al </w:t>
+      </w:r>
+      <w:r>
+        <w:rPr>
+          <w:b/>
+        </w:rPr>
+        <w:t>Art. 1594 C.C.</w:t>
+      </w:r>
+      <w:r>
+        <w:t>, EL CEDENTE podrá, a su elección, **exigir</w:t>
+      </w:r>
+    </w:p>
+    <w:p>
+      <w:r>
+        <w:t>el cumplimiento</w:t>
+      </w:r>
+      <w:r>
+        <w:rPr>
+          <w:b/>
+        </w:rPr>
+        <w:t xml:space="preserve"> del contrato </w:t>
+      </w:r>
+      <w:r>
+        <w:t>o</w:t>
+      </w:r>
+      <w:r>
+        <w:rPr>
+          <w:b/>
+        </w:rPr>
+        <w:t xml:space="preserve"> la pena, y en todo caso esta </w:t>
+      </w:r>
+      <w:r>
+        <w:t>no extingue** la</w:t>
+      </w:r>
+    </w:p>
+    <w:p>
+      <w:r>
+        <w:t>obligación principal cuando se exija el cumplimiento. Las arras retenidas (cláusula</w:t>
+      </w:r>
+    </w:p>
+    <w:p>
+      <w:r>
+        <w:t xml:space="preserve">QUINTA) se </w:t>
+      </w:r>
+      <w:r>
+        <w:rPr>
+          <w:b/>
+        </w:rPr>
+        <w:t>imputan</w:t>
+      </w:r>
+      <w:r>
+        <w:t xml:space="preserve"> a esta pena.</w:t>
+      </w:r>
+    </w:p>
+    <w:p>
+      <w:r>
+        <w:rPr>
+          <w:b/>
+        </w:rPr>
+        <w:t>OCTAVA. CONDICIÓN RESOLUTORIA POR INCUMPLIMIENTO.</w:t>
+      </w:r>
+      <w:r>
+        <w:t xml:space="preserve"> Si EL CESIONARIO </w:t>
+      </w:r>
+      <w:r>
+        <w:rPr>
+          <w:b/>
+        </w:rPr>
+        <w:t>no paga</w:t>
+      </w:r>
+      <w:r>
+        <w:t xml:space="preserve"> el</w:t>
+      </w:r>
+    </w:p>
+    <w:p>
+      <w:r>
+        <w:t>saldo del primer 50% (3 de noviembre) o el 50% final (a la escritura), EL CEDENTE</w:t>
+      </w:r>
+    </w:p>
+    <w:p>
+      <w:r>
+        <w:t xml:space="preserve">podrá, a su arbitrio, </w:t>
+      </w:r>
+      <w:r>
+        <w:rPr>
+          <w:b/>
+        </w:rPr>
+        <w:t>declarar resuelta</w:t>
+      </w:r>
+      <w:r>
+        <w:t xml:space="preserve"> la cesión y **recuperar su posición</w:t>
+      </w:r>
+    </w:p>
+    <w:p>
+      <w:r>
+        <w:t>contractual** como promitente comprador, reteniendo las arras y exigiendo la cláusula</w:t>
+      </w:r>
+    </w:p>
+    <w:p>
+      <w:r>
+        <w:t>penal, sin necesidad de requerimiento judicial previo, al que las partes renuncian.</w:t>
+      </w:r>
+    </w:p>
+    <w:p>
+      <w:r>
+        <w:rPr>
+          <w:b/>
+        </w:rPr>
+        <w:t>NOVENA. SANEAMIENTO DEL FOLIO (CONDICIÓN).</w:t>
+      </w:r>
+      <w:r>
+        <w:t xml:space="preserve"> Para la escritura, el folio deberá</w:t>
+      </w:r>
+    </w:p>
+    <w:p>
+      <w:r>
+        <w:t xml:space="preserve">quedar </w:t>
       </w:r>
       <w:r>
         <w:rPr>
@@ -553,17 +784,17 @@
         <w:t>cancelación registrada</w:t>
       </w:r>
       <w:r>
-        <w:t xml:space="preserve"> del</w:t>
+        <w:t xml:space="preserve"> del Patrimonio de</w:t>
       </w:r>
     </w:p>
     <w:p>
       <w:r>
-        <w:t>Patrimonio de Familia, el levantamiento de la Afectación a Vivienda Familiar (con</w:t>
+        <w:t>Familia, el levantamiento de la Afectación a Vivienda Familiar (con Martha y Luis</w:t>
       </w:r>
     </w:p>
     <w:p>
       <w:r>
-        <w:t xml:space="preserve">Martha y Luis Eduardo) y el </w:t>
+        <w:t xml:space="preserve">Eduardo) y el </w:t>
       </w:r>
       <w:r>
         <w:rPr>
@@ -572,17 +803,17 @@
         <w:t>retiro registrado de ISVIMED</w:t>
       </w:r>
       <w:r>
-        <w:t xml:space="preserve"> (prohibición de</w:t>
+        <w:t xml:space="preserve"> (prohibición de transferencia y derecho</w:t>
       </w:r>
     </w:p>
     <w:p>
       <w:r>
-        <w:t>transferencia y derecho de preferencia, Ley 1537 de 2012). El saneamiento está a cargo</w:t>
+        <w:t>de preferencia, Ley 1537 de 2012). El saneamiento está a cargo de la parte vendedora</w:t>
       </w:r>
     </w:p>
     <w:p>
       <w:r>
-        <w:t>de la parte vendedora en los términos de la promesa.</w:t>
+        <w:t>en los términos de la promesa.</w:t>
       </w:r>
     </w:p>
     <w:p>
@@ -590,10 +821,15 @@
         <w:rPr>
           <w:b/>
         </w:rPr>
-        <w:t>SÉPTIMA. ESCRITURACIÓN.</w:t>
+        <w:t>DÉCIMA. ESCRITURACIÓN.</w:t>
       </w:r>
       <w:r>
-        <w:t xml:space="preserve"> La escritura se otorgará en la Notaría </w:t>
+        <w:t xml:space="preserve"> La escritura pública de compraventa se otorgará a favor de</w:t>
+      </w:r>
+    </w:p>
+    <w:p>
+      <w:r>
+        <w:t xml:space="preserve">EL CESIONARIO en la Notaría </w:t>
       </w:r>
       <w:r>
         <w:rPr>
@@ -602,12 +838,7 @@
         <w:t>[__]</w:t>
       </w:r>
       <w:r>
-        <w:t xml:space="preserve"> del Círculo</w:t>
-      </w:r>
-    </w:p>
-    <w:p>
-      <w:r>
-        <w:t xml:space="preserve">de </w:t>
+        <w:t xml:space="preserve"> del Círculo de </w:t>
       </w:r>
       <w:r>
         <w:rPr>
@@ -616,7 +847,54 @@
         <w:t>[Medellín]</w:t>
       </w:r>
       <w:r>
-        <w:t>, en la fecha que determine EL CESIONARIO una vez saneado el folio</w:t>
+        <w:t>, el día **12 de</w:t>
+      </w:r>
+    </w:p>
+    <w:p>
+      <w:r>
+        <w:t>noviembre de 2026</w:t>
+      </w:r>
+      <w:r>
+        <w:rPr>
+          <w:b/>
+        </w:rPr>
+        <w:t xml:space="preserve"> a las </w:t>
+      </w:r>
+      <w:r>
+        <w:t>[hora]</w:t>
+      </w:r>
+      <w:r>
+        <w:rPr>
+          <w:b/>
+        </w:rPr>
+        <w:t xml:space="preserve">. El </w:t>
+      </w:r>
+      <w:r>
+        <w:t>pago del 50% final es simultáneo** con la</w:t>
+      </w:r>
+    </w:p>
+    <w:p>
+      <w:r>
+        <w:t>firma de la escritura (EL CESIONARIO no recibe el título sin pagar, ni EL CEDENTE/los</w:t>
+      </w:r>
+    </w:p>
+    <w:p>
+      <w:r>
+        <w:t>vendedores escrituran sin recibir el saldo).</w:t>
+      </w:r>
+    </w:p>
+    <w:p>
+      <w:r>
+        <w:t xml:space="preserve">PARÁGRAFO: si para esa fecha el folio </w:t>
+      </w:r>
+      <w:r>
+        <w:rPr>
+          <w:b/>
+        </w:rPr>
+        <w:t>no está saneado</w:t>
+      </w:r>
+      <w:r>
+        <w:t xml:space="preserve"> (cláusula NOVENA), la fecha se</w:t>
       </w:r>
     </w:p>
     <w:p>
@@ -624,15 +902,20 @@
         <w:rPr>
           <w:b/>
         </w:rPr>
-        <w:t>[o a más tardar el [__] de [____] de 202_]</w:t>
+        <w:t>prorrogará</w:t>
       </w:r>
       <w:r>
-        <w:t>. EL CEDENTE y/o EL CESIONARIO</w:t>
+        <w:t xml:space="preserve"> de común acuerdo mediante otrosí hasta el saneamiento registrado,</w:t>
       </w:r>
     </w:p>
     <w:p>
       <w:r>
-        <w:t>coordinarán con la parte vendedora la firma de la escritura a favor de EL CESIONARIO.</w:t>
+        <w:t>manteniéndose el precio, las arras y los pagos ya efectuados; el 50% final se pagará el</w:t>
+      </w:r>
+    </w:p>
+    <w:p>
+      <w:r>
+        <w:t>día de la escritura efectivamente otorgada.</w:t>
       </w:r>
     </w:p>
     <w:p>
@@ -640,21 +923,88 @@
         <w:rPr>
           <w:b/>
         </w:rPr>
-        <w:t>OCTAVA. DECLARACIONES.</w:t>
+        <w:t>DÉCIMA PRIMERA. ENTREGA MATERIAL.</w:t>
       </w:r>
       <w:r>
-        <w:t xml:space="preserve"> EL CEDENTE declara estar al día en sus obligaciones frente</w:t>
+        <w:t xml:space="preserve"> La entrega material del inmueble, a paz y salvo</w:t>
       </w:r>
     </w:p>
     <w:p>
       <w:r>
-        <w:t>a la promesa (incluido el pago íntegro del precio a los vendedores). Las partes</w:t>
+        <w:t>por servicios públicos, administración y predial, se hará **una vez pagado la totalidad</w:t>
       </w:r>
     </w:p>
     <w:p>
       <w:r>
-        <w:t xml:space="preserve">reconocen el carácter </w:t>
+        <w:t>del precio de la cesión y otorgada la escritura</w:t>
       </w:r>
+      <w:r>
+        <w:rPr>
+          <w:b/>
+        </w:rPr>
+        <w:t xml:space="preserve"> </w:t>
+      </w:r>
+      <w:r>
+        <w:t>[o dentro de los [__] días</w:t>
+      </w:r>
+    </w:p>
+    <w:p>
+      <w:r>
+        <w:t>siguientes]**.</w:t>
+      </w:r>
+    </w:p>
+    <w:p>
+      <w:r>
+        <w:rPr>
+          <w:b/>
+        </w:rPr>
+        <w:t>DÉCIMA SEGUNDA. DECLARACIONES DEL CESIONARIO.</w:t>
+      </w:r>
+      <w:r>
+        <w:t xml:space="preserve"> EL CESIONARIO declara que **conoce y</w:t>
+      </w:r>
+    </w:p>
+    <w:p>
+      <w:r>
+        <w:t>acepta** íntegramente la promesa del 21 de agosto de 2026 y su otrosí, el estado del</w:t>
+      </w:r>
+    </w:p>
+    <w:p>
+      <w:r>
+        <w:t xml:space="preserve">folio de matrícula 01N-5433420, las </w:t>
+      </w:r>
+      <w:r>
+        <w:rPr>
+          <w:b/>
+        </w:rPr>
+        <w:t>limitaciones vigentes</w:t>
+      </w:r>
+      <w:r>
+        <w:t xml:space="preserve"> y el trámite de</w:t>
+      </w:r>
+    </w:p>
+    <w:p>
+      <w:r>
+        <w:t>saneamiento en curso, subrogándose en la posición del promitente comprador en esas</w:t>
+      </w:r>
+    </w:p>
+    <w:p>
+      <w:r>
+        <w:t>condiciones.</w:t>
+      </w:r>
+    </w:p>
+    <w:p>
+      <w:r>
+        <w:rPr>
+          <w:b/>
+        </w:rPr>
+        <w:t>DÉCIMA TERCERA. DECLARACIONES TRIBUTARIAS.</w:t>
+      </w:r>
+      <w:r>
+        <w:t xml:space="preserve"> Las partes reconocen el carácter</w:t>
+      </w:r>
+    </w:p>
+    <w:p>
       <w:r>
         <w:rPr>
           <w:b/>
@@ -662,12 +1012,17 @@
         <w:t>gravado</w:t>
       </w:r>
       <w:r>
-        <w:t xml:space="preserve"> del ingreso por la cesión y que cada una asume sus</w:t>
+        <w:t xml:space="preserve"> del ingreso que percibe EL CEDENTE por esta cesión (renta ordinaria) y que</w:t>
       </w:r>
     </w:p>
     <w:p>
       <w:r>
-        <w:t>obligaciones tributarias.</w:t>
+        <w:t>cada una asume sus propias obligaciones tributarias. **Ambas declaran que el precio aquí</w:t>
+      </w:r>
+    </w:p>
+    <w:p>
+      <w:r>
+        <w:t>pactado es el real de la operación.**</w:t>
       </w:r>
     </w:p>
     <w:p>
@@ -675,20 +1030,89 @@
         <w:rPr>
           <w:b/>
         </w:rPr>
-        <w:t>NOVENA. GASTOS.</w:t>
+        <w:t>DÉCIMA CUARTA. MÉRITO EJECUTIVO.</w:t>
       </w:r>
       <w:r>
-        <w:t xml:space="preserve"> **[Definir: notariales, registro, impuesto de registro, etc. —</w:t>
+        <w:t xml:space="preserve"> Este contrato contiene obligaciones **claras,</w:t>
       </w:r>
     </w:p>
     <w:p>
       <w:r>
-        <w:t>sugerencia: notariales 50/50; registro y beneficencia por EL CESIONARIO; retención en</w:t>
+        <w:t>expresas y exigibles</w:t>
+      </w:r>
+      <w:r>
+        <w:rPr>
+          <w:b/>
+        </w:rPr>
+        <w:t xml:space="preserve"> y presta </w:t>
+      </w:r>
+      <w:r>
+        <w:t>mérito ejecutivo** (Art. 422 C.G.P.) respecto de los</w:t>
       </w:r>
     </w:p>
     <w:p>
       <w:r>
-        <w:t>la fuente de la cesión según corresponda a EL CEDENTE].**</w:t>
+        <w:t>pagos a cargo de EL CESIONARIO.</w:t>
+      </w:r>
+    </w:p>
+    <w:p>
+      <w:r>
+        <w:rPr>
+          <w:b/>
+        </w:rPr>
+        <w:t>DÉCIMA QUINTA. GASTOS.</w:t>
+      </w:r>
+      <w:r>
+        <w:t xml:space="preserve"> **[Definir: notariales de la escritura por partes iguales;</w:t>
+      </w:r>
+    </w:p>
+    <w:p>
+      <w:r>
+        <w:t>registro, impuesto de registro y beneficencia por EL CESIONARIO; retención en la fuente</w:t>
+      </w:r>
+    </w:p>
+    <w:p>
+      <w:r>
+        <w:t>según corresponda; gastos de saneamiento por la parte vendedora].**</w:t>
+      </w:r>
+    </w:p>
+    <w:p>
+      <w:r>
+        <w:rPr>
+          <w:b/>
+        </w:rPr>
+        <w:t>DÉCIMA SEXTA. DOMICILIO Y LEY APLICABLE.</w:t>
+      </w:r>
+      <w:r>
+        <w:t xml:space="preserve"> El domicilio contractual es </w:t>
+      </w:r>
+      <w:r>
+        <w:rPr>
+          <w:b/>
+        </w:rPr>
+        <w:t>Medellín</w:t>
+      </w:r>
+      <w:r>
+        <w:t xml:space="preserve"> y</w:t>
+      </w:r>
+    </w:p>
+    <w:p>
+      <w:r>
+        <w:t>se aplican las leyes colombianas; las controversias se resolverán ante los jueces</w:t>
+      </w:r>
+    </w:p>
+    <w:p>
+      <w:r>
+        <w:t xml:space="preserve">competentes de Medellín, previa </w:t>
+      </w:r>
+      <w:r>
+        <w:rPr>
+          <w:b/>
+        </w:rPr>
+        <w:t>conciliación</w:t>
+      </w:r>
+      <w:r>
+        <w:t>.</w:t>
       </w:r>
     </w:p>
     <w:p>
@@ -711,7 +1135,7 @@
         <w:t>[____]</w:t>
       </w:r>
       <w:r>
-        <w:t xml:space="preserve"> de 202_, en</w:t>
+        <w:t xml:space="preserve"> de 2026, en</w:t>
       </w:r>
     </w:p>
     <w:p>
@@ -719,10 +1143,10 @@
         <w:rPr>
           <w:b/>
         </w:rPr>
-        <w:t>[dos]</w:t>
+        <w:t>dos (2)</w:t>
       </w:r>
       <w:r>
-        <w:t xml:space="preserve"> ejemplares.</w:t>
+        <w:t xml:space="preserve"> ejemplares de igual tenor.</w:t>
       </w:r>
     </w:p>
     <w:p>

</xml_diff>

<commit_message>
Cesión apto 9840: datos finales (Notaría 4, penal 15%, cláusula de cesión 12ª, gastos)
- Cita cláusulas DÉCIMA SEGUNDA y TERCERA de la promesa con Martha (facultad de ceder).
- Penal al 15% ($23.25M); escritura Notaría 4 de Medellín, 12-nov 10 a.m.
- Aclara escritura a $120M (ya pagada) y cesión $155M documentando el margen.
- Gastos: notariales 50/50, registro al cesionario, levantamientos por el cedente.

Co-Authored-By: Claude Opus 4.8 <noreply@anthropic.com>
Claude-Session: https://claude.ai/code/session_01V3nTS2cxs4zGL1pJrFeNth
</commit_message>
<xml_diff>
--- a/flipping-02-el-tirol-3-apto-9840/Cesion-Posicion-Contractual-9840-DEFINITIVO.docx
+++ b/flipping-02-el-tirol-3-apto-9840/Cesion-Posicion-Contractual-9840-DEFINITIVO.docx
@@ -124,7 +124,7 @@
         <w:rPr>
           <w:b/>
         </w:rPr>
-        <w:t>[ciudad]</w:t>
+        <w:t>Medellín</w:t>
       </w:r>
       <w:r>
         <w:t xml:space="preserve">, identificado con la cédula de ciudadanía número </w:t>
@@ -258,53 +258,73 @@
         <w:t>SEGUNDA. FACULTAD DE CEDER (SIN NOTIFICACIÓN NI AUTORIZACIÓN).</w:t>
       </w:r>
       <w:r>
-        <w:t xml:space="preserve"> La citada promesa</w:t>
+        <w:t xml:space="preserve"> La citada promesa,</w:t>
       </w:r>
     </w:p>
     <w:p>
+      <w:r>
+        <w:t>en su **cláusula DÉCIMA SEGUNDA (Cesión, comercialización de la promesa y designación</w:t>
+      </w:r>
+    </w:p>
+    <w:p>
+      <w:r>
+        <w:t>de tercero comprador)</w:t>
+      </w:r>
       <w:r>
         <w:rPr>
           <w:b/>
         </w:rPr>
-        <w:t>faculta expresamente a EL CEDENTE para ceder su posición contractual</w:t>
-      </w:r>
-      <w:r>
-        <w:t>, designar un</w:t>
+        <w:t xml:space="preserve">, </w:t>
+      </w:r>
+      <w:r>
+        <w:t>faculta expresa, previa, irrevocable e incondicionalmente a</w:t>
       </w:r>
     </w:p>
     <w:p>
       <w:r>
-        <w:t>tercero y/o disponer que la escritura se otorgue a favor de quien él indique, **sin</w:t>
+        <w:t>EL CEDENTE para ceder, transferir, negociar o disponer de su posición contractual**,</w:t>
       </w:r>
     </w:p>
     <w:p>
       <w:r>
-        <w:t>necesidad de aviso previo ni de autorización de la parte vendedora</w:t>
-      </w:r>
+        <w:t>total o parcialmente, a favor de cualquier persona que determine, **incluso por un</w:t>
+      </w:r>
+    </w:p>
+    <w:p>
+      <w:r>
+        <w:t>valor superior al pactado**, sin requerirse autorización adicional, consentimiento</w:t>
+      </w:r>
+    </w:p>
+    <w:p>
+      <w:r>
+        <w:t>posterior ni suscripción de documento alguno por la parte vendedora; y en su</w:t>
+      </w:r>
+    </w:p>
+    <w:p>
       <w:r>
         <w:rPr>
           <w:b/>
         </w:rPr>
-        <w:t xml:space="preserve"> (cláusula </w:t>
-      </w:r>
-      <w:r>
-        <w:t>[__]**</w:t>
+        <w:t>cláusula DÉCIMA TERCERA</w:t>
+      </w:r>
+      <w:r>
+        <w:t>, la parte vendedora **renunció a oponerse, a exigir aumento</w:t>
       </w:r>
     </w:p>
     <w:p>
       <w:r>
-        <w:t>de la promesa del 21 de agosto de 2026). En virtud de dicha estipulación, la presente</w:t>
+        <w:t>de precio y a reclamar participación en el mayor valor**. En virtud de ello, la</w:t>
       </w:r>
     </w:p>
     <w:p>
       <w:r>
-        <w:t xml:space="preserve">cesión </w:t>
+        <w:t xml:space="preserve">presente cesión </w:t>
       </w:r>
       <w:r>
         <w:rPr>
           <w:b/>
         </w:rPr>
-        <w:t>no requiere la comparecencia, notificación ni consentimiento</w:t>
+        <w:t>no requiere comparecencia, notificación ni consentimiento</w:t>
       </w:r>
       <w:r>
         <w:t xml:space="preserve"> de los</w:t>
@@ -312,7 +332,7 @@
     </w:p>
     <w:p>
       <w:r>
-        <w:t>contratantes cedidos (vendedores).</w:t>
+        <w:t>contratantes cedidos.</w:t>
       </w:r>
     </w:p>
     <w:p>
@@ -574,20 +594,20 @@
         <w:rPr>
           <w:b/>
         </w:rPr>
-        <w:t>SEXTA. ESTADO DEL PRECIO DE LA PROMESA.</w:t>
-      </w:r>
-      <w:r>
-        <w:t xml:space="preserve"> Las partes dejan constancia de que EL</w:t>
+        <w:t>SEXTA. ESTADO DEL PRECIO DE LA PROMESA Y PRECIO DE LA ESCRITURA.</w:t>
+      </w:r>
+      <w:r>
+        <w:t xml:space="preserve"> Las partes dejan</w:t>
       </w:r>
     </w:p>
     <w:p>
       <w:r>
-        <w:t>CEDENTE **ya pagó en su totalidad a los vendedores el precio de la promesa</w:t>
+        <w:t>constancia de que EL CEDENTE **ya pagó en su totalidad a los vendedores el precio de la</w:t>
       </w:r>
     </w:p>
     <w:p>
       <w:r>
-        <w:t>($120.000.000)</w:t>
+        <w:t>promesa ($120.000.000)</w:t>
       </w:r>
       <w:r>
         <w:rPr>
@@ -596,26 +616,107 @@
         <w:t xml:space="preserve">, por lo que </w:t>
       </w:r>
       <w:r>
-        <w:t>no queda saldo pendiente a favor de los vendedores**. El</w:t>
+        <w:t>no queda saldo pendiente a favor de los</w:t>
       </w:r>
     </w:p>
     <w:p>
       <w:r>
-        <w:t xml:space="preserve">único pago pendiente es el </w:t>
+        <w:t>vendedores**. En consecuencia:</w:t>
+      </w:r>
+    </w:p>
+    <w:p>
+      <w:pPr>
+        <w:pStyle w:val="ListBullet"/>
+      </w:pPr>
+      <w:r>
+        <w:t xml:space="preserve">La </w:t>
       </w:r>
       <w:r>
         <w:rPr>
           <w:b/>
         </w:rPr>
-        <w:t>precio de la cesión</w:t>
-      </w:r>
-      <w:r>
-        <w:t xml:space="preserve"> (cláusula CUARTA), a favor de EL</w:t>
+        <w:t>Escritura Pública de compraventa (vendedores → EL CESIONARIO)</w:t>
+      </w:r>
+      <w:r>
+        <w:t xml:space="preserve"> se otorgará por</w:t>
       </w:r>
     </w:p>
     <w:p>
       <w:r>
-        <w:t>CEDENTE.</w:t>
+        <w:t xml:space="preserve">  el </w:t>
+      </w:r>
+      <w:r>
+        <w:rPr>
+          <w:b/>
+        </w:rPr>
+        <w:t>precio de la promesa, $120.000.000</w:t>
+      </w:r>
+      <w:r>
+        <w:t>, que se declarará **pagado en su totalidad</w:t>
+      </w:r>
+    </w:p>
+    <w:p>
+      <w:r>
+        <w:t xml:space="preserve">  con anterioridad** por conducto de EL CEDENTE (promitente comprador original).</w:t>
+      </w:r>
+    </w:p>
+    <w:p>
+      <w:pPr>
+        <w:pStyle w:val="ListBullet"/>
+      </w:pPr>
+      <w:r>
+        <w:t xml:space="preserve">El </w:t>
+      </w:r>
+      <w:r>
+        <w:rPr>
+          <w:b/>
+        </w:rPr>
+        <w:t>precio de la cesión ($155.000.000)</w:t>
+      </w:r>
+      <w:r>
+        <w:t xml:space="preserve"> de la cláusula CUARTA, que paga EL</w:t>
+      </w:r>
+    </w:p>
+    <w:p>
+      <w:r>
+        <w:t xml:space="preserve">  CESIONARIO a EL CEDENTE, </w:t>
+      </w:r>
+      <w:r>
+        <w:rPr>
+          <w:b/>
+        </w:rPr>
+        <w:t>comprende el reembolso de los $120.000.000</w:t>
+      </w:r>
+      <w:r>
+        <w:t xml:space="preserve"> que EL CEDENTE</w:t>
+      </w:r>
+    </w:p>
+    <w:p>
+      <w:r>
+        <w:t xml:space="preserve">  pagó a los vendedores </w:t>
+      </w:r>
+      <w:r>
+        <w:rPr>
+          <w:b/>
+        </w:rPr>
+        <w:t>más su margen ($35.000.000)</w:t>
+      </w:r>
+      <w:r>
+        <w:t>, el cual constituye **ingreso</w:t>
+      </w:r>
+    </w:p>
+    <w:p>
+      <w:r>
+        <w:t xml:space="preserve">  gravado de EL CEDENTE</w:t>
+      </w:r>
+      <w:r>
+        <w:rPr>
+          <w:b/>
+        </w:rPr>
+        <w:t xml:space="preserve"> y queda así </w:t>
+      </w:r>
+      <w:r>
+        <w:t>plenamente documentado**.</w:t>
       </w:r>
     </w:p>
     <w:p>
@@ -640,17 +741,22 @@
         <w:t>pena</w:t>
       </w:r>
       <w:r>
-        <w:t>, una suma equivalente al **veinte por</w:t>
+        <w:t>, una suma equivalente al **quince por</w:t>
       </w:r>
     </w:p>
     <w:p>
       <w:r>
-        <w:t>ciento (20%) del precio de la cesión — $31.000.000**, como estimación anticipada de</w:t>
+        <w:t>ciento (15%) del precio de la cesión — $23.250.000**, como estimación anticipada de</w:t>
       </w:r>
     </w:p>
     <w:p>
       <w:r>
-        <w:t xml:space="preserve">perjuicios. Conforme al </w:t>
+        <w:t>perjuicios, exigible por vía ejecutiva sin constitución en mora ni requerimiento.</w:t>
+      </w:r>
+    </w:p>
+    <w:p>
+      <w:r>
+        <w:t xml:space="preserve">Conforme al </w:t>
       </w:r>
       <w:r>
         <w:rPr>
@@ -659,12 +765,12 @@
         <w:t>Art. 1594 C.C.</w:t>
       </w:r>
       <w:r>
-        <w:t>, EL CEDENTE podrá, a su elección, **exigir</w:t>
+        <w:t>, EL CEDENTE podrá, a su elección, **exigir el</w:t>
       </w:r>
     </w:p>
     <w:p>
       <w:r>
-        <w:t>el cumplimiento</w:t>
+        <w:t>cumplimiento</w:t>
       </w:r>
       <w:r>
         <w:rPr>
@@ -789,31 +895,59 @@
     </w:p>
     <w:p>
       <w:r>
-        <w:t>Familia, el levantamiento de la Afectación a Vivienda Familiar (con Martha y Luis</w:t>
+        <w:t>Familia, el levantamiento de la Afectación a Vivienda Familiar y el **retiro registrado</w:t>
       </w:r>
     </w:p>
     <w:p>
       <w:r>
-        <w:t xml:space="preserve">Eduardo) y el </w:t>
+        <w:t>de ISVIMED** (prohibición de transferencia y derecho de preferencia, Ley 1537 de 2012).</w:t>
+      </w:r>
+    </w:p>
+    <w:p>
+      <w:r>
+        <w:t xml:space="preserve">La </w:t>
       </w:r>
       <w:r>
         <w:rPr>
           <w:b/>
         </w:rPr>
-        <w:t>retiro registrado de ISVIMED</w:t>
-      </w:r>
-      <w:r>
-        <w:t xml:space="preserve"> (prohibición de transferencia y derecho</w:t>
+        <w:t>gestión y los costos</w:t>
+      </w:r>
+      <w:r>
+        <w:t xml:space="preserve"> del levantamiento del Patrimonio de Familia y de la</w:t>
       </w:r>
     </w:p>
     <w:p>
       <w:r>
-        <w:t>de preferencia, Ley 1537 de 2012). El saneamiento está a cargo de la parte vendedora</w:t>
+        <w:t xml:space="preserve">Afectación a Vivienda Familiar serán </w:t>
+      </w:r>
+      <w:r>
+        <w:rPr>
+          <w:b/>
+        </w:rPr>
+        <w:t>asumidos por EL CEDENTE (Nicolás)</w:t>
+      </w:r>
+      <w:r>
+        <w:t>, sin</w:t>
       </w:r>
     </w:p>
     <w:p>
       <w:r>
-        <w:t>en los términos de la promesa.</w:t>
+        <w:t xml:space="preserve">perjuicio de la </w:t>
+      </w:r>
+      <w:r>
+        <w:rPr>
+          <w:b/>
+        </w:rPr>
+        <w:t>comparecencia</w:t>
+      </w:r>
+      <w:r>
+        <w:t xml:space="preserve"> que legalmente deban hacer los vendedores (Martha y</w:t>
+      </w:r>
+    </w:p>
+    <w:p>
+      <w:r>
+        <w:t>Luis Eduardo) donde el trámite lo exija.</w:t>
       </w:r>
     </w:p>
     <w:p>
@@ -829,45 +963,27 @@
     </w:p>
     <w:p>
       <w:r>
-        <w:t xml:space="preserve">EL CESIONARIO en la Notaría </w:t>
+        <w:t xml:space="preserve">EL CESIONARIO en la </w:t>
       </w:r>
       <w:r>
         <w:rPr>
           <w:b/>
         </w:rPr>
-        <w:t>[__]</w:t>
-      </w:r>
-      <w:r>
-        <w:t xml:space="preserve"> del Círculo de </w:t>
+        <w:t>Notaría Cuarta (4ª) del Círculo de Medellín</w:t>
+      </w:r>
+      <w:r>
+        <w:t>, el día **12 de</w:t>
+      </w:r>
+    </w:p>
+    <w:p>
+      <w:r>
+        <w:t>noviembre de 2026 a las 10:00 a.m.</w:t>
       </w:r>
       <w:r>
         <w:rPr>
           <w:b/>
         </w:rPr>
-        <w:t>[Medellín]</w:t>
-      </w:r>
-      <w:r>
-        <w:t>, el día **12 de</w:t>
-      </w:r>
-    </w:p>
-    <w:p>
-      <w:r>
-        <w:t>noviembre de 2026</w:t>
-      </w:r>
-      <w:r>
-        <w:rPr>
-          <w:b/>
-        </w:rPr>
-        <w:t xml:space="preserve"> a las </w:t>
-      </w:r>
-      <w:r>
-        <w:t>[hora]</w:t>
-      </w:r>
-      <w:r>
-        <w:rPr>
-          <w:b/>
-        </w:rPr>
-        <w:t xml:space="preserve">. El </w:t>
+        <w:t xml:space="preserve"> El </w:t>
       </w:r>
       <w:r>
         <w:t>pago del 50% final es simultáneo** con la</w:t>
@@ -1062,18 +1178,88 @@
         </w:rPr>
         <w:t>DÉCIMA QUINTA. GASTOS.</w:t>
       </w:r>
-      <w:r>
-        <w:t xml:space="preserve"> **[Definir: notariales de la escritura por partes iguales;</w:t>
-      </w:r>
     </w:p>
     <w:p>
-      <w:r>
-        <w:t>registro, impuesto de registro y beneficencia por EL CESIONARIO; retención en la fuente</w:t>
+      <w:pPr>
+        <w:pStyle w:val="ListBullet"/>
+      </w:pPr>
+      <w:r>
+        <w:rPr>
+          <w:b/>
+        </w:rPr>
+        <w:t>Gastos notariales y rentas departamentales de la escritura:</w:t>
+      </w:r>
+      <w:r>
+        <w:t xml:space="preserve"> por </w:t>
+      </w:r>
+      <w:r>
+        <w:rPr>
+          <w:b/>
+        </w:rPr>
+        <w:t>partes iguales</w:t>
       </w:r>
     </w:p>
     <w:p>
       <w:r>
-        <w:t>según corresponda; gastos de saneamiento por la parte vendedora].**</w:t>
+        <w:t xml:space="preserve">  (50% / 50%).</w:t>
+      </w:r>
+    </w:p>
+    <w:p>
+      <w:pPr>
+        <w:pStyle w:val="ListBullet"/>
+      </w:pPr>
+      <w:r>
+        <w:rPr>
+          <w:b/>
+        </w:rPr>
+        <w:t>Registro e impuesto de registro / beneficencia de la escritura:</w:t>
+      </w:r>
+      <w:r>
+        <w:t xml:space="preserve"> por **EL</w:t>
+      </w:r>
+    </w:p>
+    <w:p>
+      <w:r>
+        <w:t xml:space="preserve">  CESIONARIO**.</w:t>
+      </w:r>
+    </w:p>
+    <w:p>
+      <w:pPr>
+        <w:pStyle w:val="ListBullet"/>
+      </w:pPr>
+      <w:r>
+        <w:rPr>
+          <w:b/>
+        </w:rPr>
+        <w:t>Levantamiento del Patrimonio de Familia y de la Afectación a Vivienda Familiar:</w:t>
+      </w:r>
+    </w:p>
+    <w:p>
+      <w:r>
+        <w:t xml:space="preserve">  por </w:t>
+      </w:r>
+      <w:r>
+        <w:rPr>
+          <w:b/>
+        </w:rPr>
+        <w:t>EL CEDENTE (Nicolás)</w:t>
+      </w:r>
+      <w:r>
+        <w:t>.</w:t>
+      </w:r>
+    </w:p>
+    <w:p>
+      <w:pPr>
+        <w:pStyle w:val="ListBullet"/>
+      </w:pPr>
+      <w:r>
+        <w:rPr>
+          <w:b/>
+        </w:rPr>
+        <w:t>Retención en la fuente:</w:t>
+      </w:r>
+      <w:r>
+        <w:t xml:space="preserve"> la que corresponda según la ley a cada parte.</w:t>
       </w:r>
     </w:p>
     <w:p>

</xml_diff>

<commit_message>
Cesión apto 9840: elimina cláusula de facultad de ceder y renumera
Co-Authored-By: Claude Opus 4.8 <noreply@anthropic.com>
Claude-Session: https://claude.ai/code/session_01V3nTS2cxs4zGL1pJrFeNth
</commit_message>
<xml_diff>
--- a/flipping-02-el-tirol-3-apto-9840/Cesion-Posicion-Contractual-9840-DEFINITIVO.docx
+++ b/flipping-02-el-tirol-3-apto-9840/Cesion-Posicion-Contractual-9840-DEFINITIVO.docx
@@ -255,92 +255,7 @@
         <w:rPr>
           <w:b/>
         </w:rPr>
-        <w:t>SEGUNDA. FACULTAD DE CEDER (SIN NOTIFICACIÓN NI AUTORIZACIÓN).</w:t>
-      </w:r>
-      <w:r>
-        <w:t xml:space="preserve"> La citada promesa,</w:t>
-      </w:r>
-    </w:p>
-    <w:p>
-      <w:r>
-        <w:t>en su **cláusula DÉCIMA SEGUNDA (Cesión, comercialización de la promesa y designación</w:t>
-      </w:r>
-    </w:p>
-    <w:p>
-      <w:r>
-        <w:t>de tercero comprador)</w:t>
-      </w:r>
-      <w:r>
-        <w:rPr>
-          <w:b/>
-        </w:rPr>
-        <w:t xml:space="preserve">, </w:t>
-      </w:r>
-      <w:r>
-        <w:t>faculta expresa, previa, irrevocable e incondicionalmente a</w:t>
-      </w:r>
-    </w:p>
-    <w:p>
-      <w:r>
-        <w:t>EL CEDENTE para ceder, transferir, negociar o disponer de su posición contractual**,</w:t>
-      </w:r>
-    </w:p>
-    <w:p>
-      <w:r>
-        <w:t>total o parcialmente, a favor de cualquier persona que determine, **incluso por un</w:t>
-      </w:r>
-    </w:p>
-    <w:p>
-      <w:r>
-        <w:t>valor superior al pactado**, sin requerirse autorización adicional, consentimiento</w:t>
-      </w:r>
-    </w:p>
-    <w:p>
-      <w:r>
-        <w:t>posterior ni suscripción de documento alguno por la parte vendedora; y en su</w:t>
-      </w:r>
-    </w:p>
-    <w:p>
-      <w:r>
-        <w:rPr>
-          <w:b/>
-        </w:rPr>
-        <w:t>cláusula DÉCIMA TERCERA</w:t>
-      </w:r>
-      <w:r>
-        <w:t>, la parte vendedora **renunció a oponerse, a exigir aumento</w:t>
-      </w:r>
-    </w:p>
-    <w:p>
-      <w:r>
-        <w:t>de precio y a reclamar participación en el mayor valor**. En virtud de ello, la</w:t>
-      </w:r>
-    </w:p>
-    <w:p>
-      <w:r>
-        <w:t xml:space="preserve">presente cesión </w:t>
-      </w:r>
-      <w:r>
-        <w:rPr>
-          <w:b/>
-        </w:rPr>
-        <w:t>no requiere comparecencia, notificación ni consentimiento</w:t>
-      </w:r>
-      <w:r>
-        <w:t xml:space="preserve"> de los</w:t>
-      </w:r>
-    </w:p>
-    <w:p>
-      <w:r>
-        <w:t>contratantes cedidos.</w:t>
-      </w:r>
-    </w:p>
-    <w:p>
-      <w:r>
-        <w:rPr>
-          <w:b/>
-        </w:rPr>
-        <w:t>TERCERA. OBJETO — CESIÓN.</w:t>
+        <w:t>SEGUNDA. OBJETO — CESIÓN.</w:t>
       </w:r>
       <w:r>
         <w:t xml:space="preserve"> EL CEDENTE **cede la totalidad de su posición</w:t>
@@ -380,7 +295,7 @@
         <w:rPr>
           <w:b/>
         </w:rPr>
-        <w:t>CUARTA. PRECIO DE LA CESIÓN Y FORMA DE PAGO.</w:t>
+        <w:t>TERCERA. PRECIO DE LA CESIÓN Y FORMA DE PAGO.</w:t>
       </w:r>
       <w:r>
         <w:t xml:space="preserve"> EL CESIONARIO pagará a EL CEDENTE,</w:t>
@@ -421,7 +336,7 @@
     </w:p>
     <w:p>
       <w:r>
-        <w:t xml:space="preserve">   cláusula QUINTA), a la </w:t>
+        <w:t xml:space="preserve">   cláusula CUARTA), a la </w:t>
       </w:r>
       <w:r>
         <w:rPr>
@@ -504,7 +419,7 @@
         <w:t>12 de noviembre de 2026</w:t>
       </w:r>
       <w:r>
-        <w:t xml:space="preserve"> (cláusula DÉCIMA).</w:t>
+        <w:t xml:space="preserve"> (cláusula NOVENA).</w:t>
       </w:r>
     </w:p>
     <w:p>
@@ -536,7 +451,7 @@
         <w:rPr>
           <w:b/>
         </w:rPr>
-        <w:t>QUINTA. ARRAS.</w:t>
+        <w:t>CUARTA. ARRAS.</w:t>
       </w:r>
       <w:r>
         <w:t xml:space="preserve"> Los $10.000.000 se entregan como **arras confirmatorias imputables</w:t>
@@ -567,26 +482,35 @@
     </w:p>
     <w:p>
       <w:r>
-        <w:t>CEDENTE podrá retenerlas** a título de parte de la pena (cláusula SÉPTIMA), sin</w:t>
+        <w:t>CEDENTE podrá retenerlas** a título de parte de la pena (cláusula SEXTA), sin perjuicio</w:t>
       </w:r>
     </w:p>
     <w:p>
       <w:r>
-        <w:t>perjuicio de las demás acciones. Si el negocio no se realiza por **causa imputable a EL</w:t>
-      </w:r>
-    </w:p>
-    <w:p>
-      <w:r>
-        <w:t>CEDENTE</w:t>
+        <w:t xml:space="preserve">de las demás acciones. Si el negocio no se realiza por </w:t>
       </w:r>
       <w:r>
         <w:rPr>
           <w:b/>
         </w:rPr>
-        <w:t xml:space="preserve">, este las </w:t>
+        <w:t>causa imputable a EL CEDENTE</w:t>
       </w:r>
       <w:r>
-        <w:t>restituirá** a EL CESIONARIO.</w:t>
+        <w:t>,</w:t>
+      </w:r>
+    </w:p>
+    <w:p>
+      <w:r>
+        <w:t xml:space="preserve">este las </w:t>
+      </w:r>
+      <w:r>
+        <w:rPr>
+          <w:b/>
+        </w:rPr>
+        <w:t>restituirá</w:t>
+      </w:r>
+      <w:r>
+        <w:t xml:space="preserve"> a EL CESIONARIO.</w:t>
       </w:r>
     </w:p>
     <w:p>
@@ -594,7 +518,7 @@
         <w:rPr>
           <w:b/>
         </w:rPr>
-        <w:t>SEXTA. ESTADO DEL PRECIO DE LA PROMESA Y PRECIO DE LA ESCRITURA.</w:t>
+        <w:t>QUINTA. ESTADO DEL PRECIO DE LA PROMESA Y PRECIO DE LA ESCRITURA.</w:t>
       </w:r>
       <w:r>
         <w:t xml:space="preserve"> Las partes dejan</w:t>
@@ -674,7 +598,7 @@
         <w:t>precio de la cesión ($155.000.000)</w:t>
       </w:r>
       <w:r>
-        <w:t xml:space="preserve"> de la cláusula CUARTA, que paga EL</w:t>
+        <w:t xml:space="preserve"> de la cláusula TERCERA, que paga EL</w:t>
       </w:r>
     </w:p>
     <w:p>
@@ -724,7 +648,7 @@
         <w:rPr>
           <w:b/>
         </w:rPr>
-        <w:t>SÉPTIMA. CLÁUSULA PENAL.</w:t>
+        <w:t>SEXTA. CLÁUSULA PENAL.</w:t>
       </w:r>
       <w:r>
         <w:t xml:space="preserve"> La parte que incumpla cualquiera de las obligaciones aquí</w:t>
@@ -798,7 +722,7 @@
     </w:p>
     <w:p>
       <w:r>
-        <w:t xml:space="preserve">QUINTA) se </w:t>
+        <w:t xml:space="preserve">CUARTA) se </w:t>
       </w:r>
       <w:r>
         <w:rPr>
@@ -815,7 +739,7 @@
         <w:rPr>
           <w:b/>
         </w:rPr>
-        <w:t>OCTAVA. CONDICIÓN RESOLUTORIA POR INCUMPLIMIENTO.</w:t>
+        <w:t>SÉPTIMA. CONDICIÓN RESOLUTORIA POR INCUMPLIMIENTO.</w:t>
       </w:r>
       <w:r>
         <w:t xml:space="preserve"> Si EL CESIONARIO </w:t>
@@ -864,7 +788,7 @@
         <w:rPr>
           <w:b/>
         </w:rPr>
-        <w:t>NOVENA. SANEAMIENTO DEL FOLIO (CONDICIÓN).</w:t>
+        <w:t>OCTAVA. SANEAMIENTO DEL FOLIO (CONDICIÓN).</w:t>
       </w:r>
       <w:r>
         <w:t xml:space="preserve"> Para la escritura, el folio deberá</w:t>
@@ -955,7 +879,7 @@
         <w:rPr>
           <w:b/>
         </w:rPr>
-        <w:t>DÉCIMA. ESCRITURACIÓN.</w:t>
+        <w:t>NOVENA. ESCRITURACIÓN.</w:t>
       </w:r>
       <w:r>
         <w:t xml:space="preserve"> La escritura pública de compraventa se otorgará a favor de</w:t>
@@ -1010,7 +934,7 @@
         <w:t>no está saneado</w:t>
       </w:r>
       <w:r>
-        <w:t xml:space="preserve"> (cláusula NOVENA), la fecha se</w:t>
+        <w:t xml:space="preserve"> (cláusula OCTAVA), la fecha se</w:t>
       </w:r>
     </w:p>
     <w:p>
@@ -1039,20 +963,20 @@
         <w:rPr>
           <w:b/>
         </w:rPr>
-        <w:t>DÉCIMA PRIMERA. ENTREGA MATERIAL.</w:t>
+        <w:t>DÉCIMA. ENTREGA MATERIAL.</w:t>
       </w:r>
       <w:r>
-        <w:t xml:space="preserve"> La entrega material del inmueble, a paz y salvo</w:t>
+        <w:t xml:space="preserve"> La entrega material del inmueble, a paz y salvo por</w:t>
       </w:r>
     </w:p>
     <w:p>
       <w:r>
-        <w:t>por servicios públicos, administración y predial, se hará **una vez pagado la totalidad</w:t>
+        <w:t>servicios públicos, administración y predial, se hará **una vez pagado la totalidad del</w:t>
       </w:r>
     </w:p>
     <w:p>
       <w:r>
-        <w:t>del precio de la cesión y otorgada la escritura</w:t>
+        <w:t>precio de la cesión y otorgada la escritura</w:t>
       </w:r>
       <w:r>
         <w:rPr>
@@ -1074,7 +998,7 @@
         <w:rPr>
           <w:b/>
         </w:rPr>
-        <w:t>DÉCIMA SEGUNDA. DECLARACIONES DEL CESIONARIO.</w:t>
+        <w:t>DÉCIMA PRIMERA. DECLARACIONES DEL CESIONARIO.</w:t>
       </w:r>
       <w:r>
         <w:t xml:space="preserve"> EL CESIONARIO declara que **conoce y</w:t>
@@ -1114,7 +1038,7 @@
         <w:rPr>
           <w:b/>
         </w:rPr>
-        <w:t>DÉCIMA TERCERA. DECLARACIONES TRIBUTARIAS.</w:t>
+        <w:t>DÉCIMA SEGUNDA. DECLARACIONES TRIBUTARIAS.</w:t>
       </w:r>
       <w:r>
         <w:t xml:space="preserve"> Las partes reconocen el carácter</w:t>
@@ -1146,7 +1070,7 @@
         <w:rPr>
           <w:b/>
         </w:rPr>
-        <w:t>DÉCIMA CUARTA. MÉRITO EJECUTIVO.</w:t>
+        <w:t>DÉCIMA TERCERA. MÉRITO EJECUTIVO.</w:t>
       </w:r>
       <w:r>
         <w:t xml:space="preserve"> Este contrato contiene obligaciones **claras,</w:t>
@@ -1176,7 +1100,7 @@
         <w:rPr>
           <w:b/>
         </w:rPr>
-        <w:t>DÉCIMA QUINTA. GASTOS.</w:t>
+        <w:t>DÉCIMA CUARTA. GASTOS.</w:t>
       </w:r>
     </w:p>
     <w:p>
@@ -1267,7 +1191,7 @@
         <w:rPr>
           <w:b/>
         </w:rPr>
-        <w:t>DÉCIMA SEXTA. DOMICILIO Y LEY APLICABLE.</w:t>
+        <w:t>DÉCIMA QUINTA. DOMICILIO Y LEY APLICABLE.</w:t>
       </w:r>
       <w:r>
         <w:t xml:space="preserve"> El domicilio contractual es </w:t>

</xml_diff>

<commit_message>
Cesión apto 9840: agrega linderos y datos catastrales del inmueble
Co-Authored-By: Claude Opus 4.8 <noreply@anthropic.com>
Claude-Session: https://claude.ai/code/session_01V3nTS2cxs4zGL1pJrFeNth
</commit_message>
<xml_diff>
--- a/flipping-02-el-tirol-3-apto-9840/Cesion-Posicion-Contractual-9840-DEFINITIVO.docx
+++ b/flipping-02-el-tirol-3-apto-9840/Cesion-Posicion-Contractual-9840-DEFINITIVO.docx
@@ -210,41 +210,372 @@
     </w:p>
     <w:p>
       <w:r>
-        <w:t xml:space="preserve">otrosí), sobre el inmueble </w:t>
-      </w:r>
-      <w:r>
-        <w:rPr>
-          <w:b/>
-        </w:rPr>
-        <w:t>Apartamento 9840</w:t>
-      </w:r>
-      <w:r>
-        <w:t>, Torre 7, Piso -2, urbanización El</w:t>
-      </w:r>
-    </w:p>
-    <w:p>
-      <w:r>
-        <w:t xml:space="preserve">Tirol 3, </w:t>
-      </w:r>
-      <w:r>
-        <w:rPr>
-          <w:b/>
-        </w:rPr>
-        <w:t>Matrícula Inmobiliaria 01N-5433420</w:t>
-      </w:r>
-      <w:r>
-        <w:t xml:space="preserve"> de la ORIP de Medellín Norte, por un</w:t>
-      </w:r>
-    </w:p>
-    <w:p>
-      <w:r>
-        <w:t xml:space="preserve">precio de </w:t>
+        <w:t xml:space="preserve">otrosí), por un precio de </w:t>
       </w:r>
       <w:r>
         <w:rPr>
           <w:b/>
         </w:rPr>
         <w:t>$120.000.000</w:t>
+      </w:r>
+      <w:r>
+        <w:t>, sobre el siguiente bien inmueble:</w:t>
+      </w:r>
+    </w:p>
+    <w:p>
+      <w:pPr>
+        <w:pStyle w:val="ListBullet"/>
+      </w:pPr>
+      <w:r>
+        <w:rPr>
+          <w:b/>
+        </w:rPr>
+        <w:t>Inmueble:</w:t>
+      </w:r>
+      <w:r>
+        <w:t xml:space="preserve"> Apartamento </w:t>
+      </w:r>
+      <w:r>
+        <w:rPr>
+          <w:b/>
+        </w:rPr>
+        <w:t>No. 9840</w:t>
+      </w:r>
+      <w:r>
+        <w:t xml:space="preserve">, ubicado en la </w:t>
+      </w:r>
+      <w:r>
+        <w:rPr>
+          <w:b/>
+        </w:rPr>
+        <w:t>Calle 66 N° 103B-56</w:t>
+      </w:r>
+      <w:r>
+        <w:t>, Piso</w:t>
+      </w:r>
+    </w:p>
+    <w:p>
+      <w:r>
+        <w:t xml:space="preserve">  </w:t>
+      </w:r>
+      <w:r>
+        <w:rPr>
+          <w:b/>
+        </w:rPr>
+        <w:t>-2</w:t>
+      </w:r>
+      <w:r>
+        <w:t xml:space="preserve"> de la </w:t>
+      </w:r>
+      <w:r>
+        <w:rPr>
+          <w:b/>
+        </w:rPr>
+        <w:t>Torre 7</w:t>
+      </w:r>
+      <w:r>
+        <w:t xml:space="preserve"> del </w:t>
+      </w:r>
+      <w:r>
+        <w:rPr>
+          <w:b/>
+        </w:rPr>
+        <w:t>Conjunto Residencial Tirol III</w:t>
+      </w:r>
+      <w:r>
+        <w:t xml:space="preserve"> (P.H.), destinado a</w:t>
+      </w:r>
+    </w:p>
+    <w:p>
+      <w:r>
+        <w:t xml:space="preserve">  vivienda, en Medellín (Antioquia).</w:t>
+      </w:r>
+    </w:p>
+    <w:p>
+      <w:pPr>
+        <w:pStyle w:val="ListBullet"/>
+      </w:pPr>
+      <w:r>
+        <w:rPr>
+          <w:b/>
+        </w:rPr>
+        <w:t>Área:</w:t>
+      </w:r>
+      <w:r>
+        <w:t xml:space="preserve"> construida aproximada de </w:t>
+      </w:r>
+      <w:r>
+        <w:rPr>
+          <w:b/>
+        </w:rPr>
+        <w:t>45,95 m²</w:t>
+      </w:r>
+      <w:r>
+        <w:t xml:space="preserve"> y altura útil de 2,30 m.</w:t>
+      </w:r>
+    </w:p>
+    <w:p>
+      <w:pPr>
+        <w:pStyle w:val="ListBullet"/>
+      </w:pPr>
+      <w:r>
+        <w:rPr>
+          <w:b/>
+        </w:rPr>
+        <w:t>Matrícula Inmobiliaria:</w:t>
+      </w:r>
+      <w:r>
+        <w:t xml:space="preserve"> </w:t>
+      </w:r>
+      <w:r>
+        <w:rPr>
+          <w:b/>
+        </w:rPr>
+        <w:t>01N-5433420</w:t>
+      </w:r>
+      <w:r>
+        <w:t xml:space="preserve"> de la ORIP de Medellín — Zona Norte.</w:t>
+      </w:r>
+    </w:p>
+    <w:p>
+      <w:pPr>
+        <w:pStyle w:val="ListBullet"/>
+      </w:pPr>
+      <w:r>
+        <w:rPr>
+          <w:b/>
+        </w:rPr>
+        <w:t>Dirección catastral:</w:t>
+      </w:r>
+      <w:r>
+        <w:t xml:space="preserve"> Calle 66 # 103 B-56 Int. 9840 — </w:t>
+      </w:r>
+      <w:r>
+        <w:rPr>
+          <w:b/>
+        </w:rPr>
+        <w:t>Código catastral:</w:t>
+      </w:r>
+    </w:p>
+    <w:p>
+      <w:r>
+        <w:t xml:space="preserve">  050010007609800380326901980040 — </w:t>
+      </w:r>
+      <w:r>
+        <w:rPr>
+          <w:b/>
+        </w:rPr>
+        <w:t>NUPRE:</w:t>
+      </w:r>
+      <w:r>
+        <w:t xml:space="preserve"> AAB0094JLYD.</w:t>
+      </w:r>
+    </w:p>
+    <w:p>
+      <w:pPr>
+        <w:pStyle w:val="ListBullet"/>
+      </w:pPr>
+      <w:r>
+        <w:rPr>
+          <w:b/>
+        </w:rPr>
+        <w:t>Reglamento de P.H.:</w:t>
+      </w:r>
+      <w:r>
+        <w:t xml:space="preserve"> Escritura Pública </w:t>
+      </w:r>
+      <w:r>
+        <w:rPr>
+          <w:b/>
+        </w:rPr>
+        <w:t>No. 4502 del 29 de noviembre de 2016</w:t>
+      </w:r>
+      <w:r>
+        <w:t>,</w:t>
+      </w:r>
+    </w:p>
+    <w:p>
+      <w:r>
+        <w:t xml:space="preserve">  Notaría Cuarta de Medellín, debidamente registrada.</w:t>
+      </w:r>
+    </w:p>
+    <w:p>
+      <w:pPr>
+        <w:pStyle w:val="ListBullet"/>
+      </w:pPr>
+      <w:r>
+        <w:rPr>
+          <w:b/>
+        </w:rPr>
+        <w:t>Linderos generales:</w:t>
+      </w:r>
+      <w:r>
+        <w:t xml:space="preserve"> Por el </w:t>
+      </w:r>
+      <w:r>
+        <w:rPr>
+          <w:b/>
+        </w:rPr>
+        <w:t>Norte</w:t>
+      </w:r>
+      <w:r>
+        <w:t>, en línea recta, con muro de cierre de</w:t>
+      </w:r>
+    </w:p>
+    <w:p>
+      <w:r>
+        <w:t xml:space="preserve">  fachada que lo separa de la zona común de circulación del edificio, entre los puntos</w:t>
+      </w:r>
+    </w:p>
+    <w:p>
+      <w:r>
+        <w:t xml:space="preserve">  3 al 4, longitud aprox. </w:t>
+      </w:r>
+      <w:r>
+        <w:rPr>
+          <w:b/>
+        </w:rPr>
+        <w:t>9,55 m</w:t>
+      </w:r>
+      <w:r>
+        <w:t xml:space="preserve">; por el </w:t>
+      </w:r>
+      <w:r>
+        <w:rPr>
+          <w:b/>
+        </w:rPr>
+        <w:t>Sur</w:t>
+      </w:r>
+      <w:r>
+        <w:t>, en línea recta con muro de cierre</w:t>
+      </w:r>
+    </w:p>
+    <w:p>
+      <w:r>
+        <w:t xml:space="preserve">  de fachada externo, entre los puntos 5 al 6, longitud aprox. </w:t>
+      </w:r>
+      <w:r>
+        <w:rPr>
+          <w:b/>
+        </w:rPr>
+        <w:t>11,85 m</w:t>
+      </w:r>
+      <w:r>
+        <w:t>; por el</w:t>
+      </w:r>
+    </w:p>
+    <w:p>
+      <w:r>
+        <w:t xml:space="preserve">  </w:t>
+      </w:r>
+      <w:r>
+        <w:rPr>
+          <w:b/>
+        </w:rPr>
+        <w:t>Oriente</w:t>
+      </w:r>
+      <w:r>
+        <w:t>, en línea recta, con muro de cierre de fachada que lo separa en parte de</w:t>
+      </w:r>
+    </w:p>
+    <w:p>
+      <w:r>
+        <w:t xml:space="preserve">  la zona común de circulación del edificio y vacío interior, entre los puntos 4 al 5,</w:t>
+      </w:r>
+    </w:p>
+    <w:p>
+      <w:r>
+        <w:t xml:space="preserve">  longitud aprox. </w:t>
+      </w:r>
+      <w:r>
+        <w:rPr>
+          <w:b/>
+        </w:rPr>
+        <w:t>4,40 m</w:t>
+      </w:r>
+      <w:r>
+        <w:t xml:space="preserve">; por el </w:t>
+      </w:r>
+      <w:r>
+        <w:rPr>
+          <w:b/>
+        </w:rPr>
+        <w:t>Occidente</w:t>
+      </w:r>
+      <w:r>
+        <w:t>, en línea recta, en parte con muro</w:t>
+      </w:r>
+    </w:p>
+    <w:p>
+      <w:r>
+        <w:t xml:space="preserve">  medianero que lo separa del Apartamento No. 9839 del piso -2 de la Torre 7, entre los</w:t>
+      </w:r>
+    </w:p>
+    <w:p>
+      <w:r>
+        <w:t xml:space="preserve">  puntos 6 y 1, longitud aprox. </w:t>
+      </w:r>
+      <w:r>
+        <w:rPr>
+          <w:b/>
+        </w:rPr>
+        <w:t>3,90 m</w:t>
+      </w:r>
+      <w:r>
+        <w:t>, y en parte en línea quebrada con buitrón</w:t>
+      </w:r>
+    </w:p>
+    <w:p>
+      <w:r>
+        <w:t xml:space="preserve">  entre los puntos 1, 2 y 3, longitud aprox. </w:t>
+      </w:r>
+      <w:r>
+        <w:rPr>
+          <w:b/>
+        </w:rPr>
+        <w:t>1,20 m</w:t>
+      </w:r>
+      <w:r>
+        <w:t xml:space="preserve">; por el </w:t>
+      </w:r>
+      <w:r>
+        <w:rPr>
+          <w:b/>
+        </w:rPr>
+        <w:t>Cenit</w:t>
+      </w:r>
+      <w:r>
+        <w:t>, con losa que</w:t>
+      </w:r>
+    </w:p>
+    <w:p>
+      <w:r>
+        <w:t xml:space="preserve">  lo separa del Apartamento No. 9940 del piso -1 de la Torre 7; por el </w:t>
+      </w:r>
+      <w:r>
+        <w:rPr>
+          <w:b/>
+        </w:rPr>
+        <w:t>Nadir</w:t>
+      </w:r>
+      <w:r>
+        <w:t>, con</w:t>
+      </w:r>
+    </w:p>
+    <w:p>
+      <w:r>
+        <w:t xml:space="preserve">  losa que lo separa del Apartamento No. 9740 de la Torre 7.</w:t>
+      </w:r>
+    </w:p>
+    <w:p>
+      <w:r>
+        <w:t xml:space="preserve">PARÁGRAFO: la venta se hace como </w:t>
+      </w:r>
+      <w:r>
+        <w:rPr>
+          <w:b/>
+        </w:rPr>
+        <w:t>cuerpo cierto</w:t>
       </w:r>
       <w:r>
         <w:t>.</w:t>

</xml_diff>

<commit_message>
Cesión apto 9840: ISVIMED ya saneado; patrimonio y afectación simultáneos a la escritura, por Nicolás
Co-Authored-By: Claude Opus 4.8 <noreply@anthropic.com>
Claude-Session: https://claude.ai/code/session_01V3nTS2cxs4zGL1pJrFeNth
</commit_message>
<xml_diff>
--- a/flipping-02-el-tirol-3-apto-9840/Cesion-Posicion-Contractual-9840-DEFINITIVO.docx
+++ b/flipping-02-el-tirol-3-apto-9840/Cesion-Posicion-Contractual-9840-DEFINITIVO.docx
@@ -1119,62 +1119,82 @@
         <w:rPr>
           <w:b/>
         </w:rPr>
-        <w:t>OCTAVA. SANEAMIENTO DEL FOLIO (CONDICIÓN).</w:t>
-      </w:r>
-      <w:r>
-        <w:t xml:space="preserve"> Para la escritura, el folio deberá</w:t>
-      </w:r>
-    </w:p>
-    <w:p>
-      <w:r>
-        <w:t xml:space="preserve">quedar </w:t>
+        <w:t>OCTAVA. SANEAMIENTO DEL FOLIO.</w:t>
+      </w:r>
+      <w:r>
+        <w:t xml:space="preserve"> El </w:t>
       </w:r>
       <w:r>
         <w:rPr>
           <w:b/>
         </w:rPr>
-        <w:t>libre de limitaciones</w:t>
-      </w:r>
-      <w:r>
-        <w:t xml:space="preserve">, con la </w:t>
+        <w:t>retiro de ISVIMED</w:t>
+      </w:r>
+      <w:r>
+        <w:t xml:space="preserve"> (prohibición de</w:t>
+      </w:r>
+    </w:p>
+    <w:p>
+      <w:r>
+        <w:t>transferencia y derecho de preferencia, Ley 1537 de 2012) **ya se encuentra</w:t>
+      </w:r>
+    </w:p>
+    <w:p>
+      <w:r>
+        <w:t>registrado</w:t>
       </w:r>
       <w:r>
         <w:rPr>
           <w:b/>
         </w:rPr>
-        <w:t>cancelación registrada</w:t>
-      </w:r>
-      <w:r>
-        <w:t xml:space="preserve"> del Patrimonio de</w:t>
+        <w:t xml:space="preserve">, por lo que esa limitación está </w:t>
+      </w:r>
+      <w:r>
+        <w:t>saneada**. Restan únicamente la</w:t>
       </w:r>
     </w:p>
     <w:p>
-      <w:r>
-        <w:t>Familia, el levantamiento de la Afectación a Vivienda Familiar y el **retiro registrado</w:t>
-      </w:r>
-    </w:p>
-    <w:p>
-      <w:r>
-        <w:t>de ISVIMED** (prohibición de transferencia y derecho de preferencia, Ley 1537 de 2012).</w:t>
-      </w:r>
-    </w:p>
-    <w:p>
-      <w:r>
-        <w:t xml:space="preserve">La </w:t>
-      </w:r>
       <w:r>
         <w:rPr>
           <w:b/>
         </w:rPr>
-        <w:t>gestión y los costos</w:t>
-      </w:r>
-      <w:r>
-        <w:t xml:space="preserve"> del levantamiento del Patrimonio de Familia y de la</w:t>
+        <w:t>cancelación del Patrimonio de Familia</w:t>
+      </w:r>
+      <w:r>
+        <w:t xml:space="preserve"> y el **levantamiento de la Afectación a</w:t>
       </w:r>
     </w:p>
     <w:p>
       <w:r>
-        <w:t xml:space="preserve">Afectación a Vivienda Familiar serán </w:t>
+        <w:t>Vivienda Familiar</w:t>
+      </w:r>
+      <w:r>
+        <w:rPr>
+          <w:b/>
+        </w:rPr>
+        <w:t xml:space="preserve">, los cuales se otorgarán </w:t>
+      </w:r>
+      <w:r>
+        <w:t>simultáneamente, en el mismo acto de la</w:t>
+      </w:r>
+    </w:p>
+    <w:p>
+      <w:r>
+        <w:t>Escritura Pública de compraventa</w:t>
+      </w:r>
+      <w:r>
+        <w:rPr>
+          <w:b/>
+        </w:rPr>
+        <w:t xml:space="preserve"> (cláusula NOVENA). La </w:t>
+      </w:r>
+      <w:r>
+        <w:t>gestión y los costos** de</w:t>
+      </w:r>
+    </w:p>
+    <w:p>
+      <w:r>
+        <w:t xml:space="preserve">ambos trámites serán </w:t>
       </w:r>
       <w:r>
         <w:rPr>
@@ -1183,13 +1203,10 @@
         <w:t>asumidos por EL CEDENTE (Nicolás)</w:t>
       </w:r>
       <w:r>
-        <w:t>, sin</w:t>
+        <w:t>, sin perjuicio de la</w:t>
       </w:r>
     </w:p>
     <w:p>
-      <w:r>
-        <w:t xml:space="preserve">perjuicio de la </w:t>
-      </w:r>
       <w:r>
         <w:rPr>
           <w:b/>
@@ -1197,12 +1214,12 @@
         <w:t>comparecencia</w:t>
       </w:r>
       <w:r>
-        <w:t xml:space="preserve"> que legalmente deban hacer los vendedores (Martha y</w:t>
+        <w:t xml:space="preserve"> que deban hacer en la escritura los vendedores (Martha y Luis</w:t>
       </w:r>
     </w:p>
     <w:p>
       <w:r>
-        <w:t>Luis Eduardo) donde el trámite lo exija.</w:t>
+        <w:t>Eduardo) y las demás personas que la ley exija.</w:t>
       </w:r>
     </w:p>
     <w:p>
@@ -1256,27 +1273,54 @@
     </w:p>
     <w:p>
       <w:r>
-        <w:t xml:space="preserve">PARÁGRAFO: si para esa fecha el folio </w:t>
+        <w:t xml:space="preserve">PARÁGRAFO: en el </w:t>
       </w:r>
       <w:r>
         <w:rPr>
           <w:b/>
         </w:rPr>
-        <w:t>no está saneado</w:t>
-      </w:r>
-      <w:r>
-        <w:t xml:space="preserve"> (cláusula OCTAVA), la fecha se</w:t>
+        <w:t>mismo acto</w:t>
+      </w:r>
+      <w:r>
+        <w:t xml:space="preserve"> de esta Escritura Pública se otorgarán la **cancelación</w:t>
       </w:r>
     </w:p>
     <w:p>
+      <w:r>
+        <w:t>del Patrimonio de Familia</w:t>
+      </w:r>
       <w:r>
         <w:rPr>
           <w:b/>
         </w:rPr>
-        <w:t>prorrogará</w:t>
-      </w:r>
-      <w:r>
-        <w:t xml:space="preserve"> de común acuerdo mediante otrosí hasta el saneamiento registrado,</w:t>
+        <w:t xml:space="preserve"> y el </w:t>
+      </w:r>
+      <w:r>
+        <w:t>levantamiento de la Afectación a Vivienda Familiar**</w:t>
+      </w:r>
+    </w:p>
+    <w:p>
+      <w:r>
+        <w:t>(cláusula OCTAVA), de modo que, con el registro de la escritura, el inmueble quede libre</w:t>
+      </w:r>
+    </w:p>
+    <w:p>
+      <w:r>
+        <w:t>de toda limitación. Si por algún trámite pendiente no fuere posible escriturar en la</w:t>
+      </w:r>
+    </w:p>
+    <w:p>
+      <w:r>
+        <w:t xml:space="preserve">fecha prevista, las partes la </w:t>
+      </w:r>
+      <w:r>
+        <w:rPr>
+          <w:b/>
+        </w:rPr>
+        <w:t>prorrogarán</w:t>
+      </w:r>
+      <w:r>
+        <w:t xml:space="preserve"> de común acuerdo mediante otrosí,</w:t>
       </w:r>
     </w:p>
     <w:p>

</xml_diff>

<commit_message>
Cesión apto 9840: QUINTA adelgazada, sin asteriscos literales ni párrafos partidos, firmas más limpias
Co-Authored-By: Claude Opus 4.8 <noreply@anthropic.com>
Claude-Session: https://claude.ai/code/session_01V3nTS2cxs4zGL1pJrFeNth
</commit_message>
<xml_diff>
--- a/flipping-02-el-tirol-3-apto-9840/Cesion-Posicion-Contractual-9840-DEFINITIVO.docx
+++ b/flipping-02-el-tirol-3-apto-9840/Cesion-Posicion-Contractual-9840-DEFINITIVO.docx
@@ -34,19 +34,7 @@
           <w:i/>
           <w:color w:val="555555"/>
         </w:rPr>
-        <w:t xml:space="preserve"> Debe revisarlo</w:t>
-      </w:r>
-    </w:p>
-    <w:p>
-      <w:pPr>
-        <w:ind w:left="360"/>
-      </w:pPr>
-      <w:r>
-        <w:rPr>
-          <w:i/>
-          <w:color w:val="555555"/>
-        </w:rPr>
-        <w:t>el abogado y la notaría. Campos entre `[ ]` por completar.</w:t>
+        <w:t xml:space="preserve"> Debe revisarlo el abogado y la notaría. Campos por completar entre corchetes.</w:t>
       </w:r>
     </w:p>
     <w:p>
@@ -71,12 +59,7 @@
         <w:t>NICOLÁS MEJÍA ACEVEDO</w:t>
       </w:r>
       <w:r>
-        <w:t>, mayor de edad, domiciliado en Medellín,</w:t>
-      </w:r>
-    </w:p>
-    <w:p>
-      <w:r>
-        <w:t xml:space="preserve">identificado con la cédula de ciudadanía número </w:t>
+        <w:t xml:space="preserve">, mayor de edad, domiciliado en Medellín, identificado con la cédula de ciudadanía número </w:t>
       </w:r>
       <w:r>
         <w:rPr>
@@ -85,10 +68,8 @@
         <w:t>1.028.031.225</w:t>
       </w:r>
       <w:r>
-        <w:t>, quien obra como</w:t>
+        <w:t xml:space="preserve">, quien obra como </w:t>
       </w:r>
-    </w:p>
-    <w:p>
       <w:r>
         <w:rPr>
           <w:b/>
@@ -116,10 +97,8 @@
         <w:t>SIMÓN ANGULO RAMÍREZ</w:t>
       </w:r>
       <w:r>
-        <w:t>, mayor de edad, domiciliado en</w:t>
+        <w:t xml:space="preserve">, mayor de edad, domiciliado en </w:t>
       </w:r>
-    </w:p>
-    <w:p>
       <w:r>
         <w:rPr>
           <w:b/>
@@ -150,12 +129,7 @@
         <w:t>CONTRATO DE CESIÓN DE POSICIÓN CONTRACTUAL</w:t>
       </w:r>
       <w:r>
-        <w:t>, que se</w:t>
-      </w:r>
-    </w:p>
-    <w:p>
-      <w:r>
-        <w:t>regirá por las leyes colombianas y en especial por las siguientes cláusulas:</w:t>
+        <w:t>, que se regirá por las leyes colombianas y en especial por las siguientes cláusulas:</w:t>
       </w:r>
     </w:p>
     <w:p>
@@ -174,10 +148,8 @@
         </w:rPr>
         <w:t>MARTHA LUCÍA MORALES ESPINAL</w:t>
       </w:r>
-    </w:p>
-    <w:p>
       <w:r>
-        <w:t xml:space="preserve">(C.C. 42.677.313) y su cónyuge </w:t>
+        <w:t xml:space="preserve"> (C.C. 42.677.313) y su cónyuge </w:t>
       </w:r>
       <w:r>
         <w:rPr>
@@ -186,17 +158,7 @@
         <w:t>LUIS EDUARDO CHAVARRÍA CARVAJAL</w:t>
       </w:r>
       <w:r>
-        <w:t xml:space="preserve"> (C.C. 70.576.777),</w:t>
-      </w:r>
-    </w:p>
-    <w:p>
-      <w:r>
-        <w:t>por pertenecer el inmueble a la sociedad conyugal— y EL CEDENTE (como promitente</w:t>
-      </w:r>
-    </w:p>
-    <w:p>
-      <w:r>
-        <w:t xml:space="preserve">comprador) se suscribió </w:t>
+        <w:t xml:space="preserve"> (C.C. 70.576.777), por pertenecer el inmueble a la sociedad conyugal— y EL CEDENTE (como promitente comprador) se suscribió </w:t>
       </w:r>
       <w:r>
         <w:rPr>
@@ -205,12 +167,7 @@
         <w:t>Promesa de Compraventa el 21 de agosto de 2026</w:t>
       </w:r>
       <w:r>
-        <w:t xml:space="preserve"> (con su</w:t>
-      </w:r>
-    </w:p>
-    <w:p>
-      <w:r>
-        <w:t xml:space="preserve">otrosí), por un precio de </w:t>
+        <w:t xml:space="preserve"> (con su otrosí), por un precio de </w:t>
       </w:r>
       <w:r>
         <w:rPr>
@@ -251,12 +208,7 @@
         <w:t>Calle 66 N° 103B-56</w:t>
       </w:r>
       <w:r>
-        <w:t>, Piso</w:t>
-      </w:r>
-    </w:p>
-    <w:p>
-      <w:r>
-        <w:t xml:space="preserve">  </w:t>
+        <w:t xml:space="preserve">, Piso </w:t>
       </w:r>
       <w:r>
         <w:rPr>
@@ -283,12 +235,7 @@
         <w:t>Conjunto Residencial Tirol III</w:t>
       </w:r>
       <w:r>
-        <w:t xml:space="preserve"> (P.H.), destinado a</w:t>
-      </w:r>
-    </w:p>
-    <w:p>
-      <w:r>
-        <w:t xml:space="preserve">  vivienda, en Medellín (Antioquia).</w:t>
+        <w:t xml:space="preserve"> (P.H.), destinado a vivienda, en Medellín (Antioquia).</w:t>
       </w:r>
     </w:p>
     <w:p>
@@ -348,7 +295,7 @@
         <w:t>Dirección catastral:</w:t>
       </w:r>
       <w:r>
-        <w:t xml:space="preserve"> Calle 66 # 103 B-56 Int. 9840 — </w:t>
+        <w:t xml:space="preserve"> Calle 66 # 103 B-56 Int. 9840. </w:t>
       </w:r>
       <w:r>
         <w:rPr>
@@ -356,10 +303,8 @@
         </w:rPr>
         <w:t>Código catastral:</w:t>
       </w:r>
-    </w:p>
-    <w:p>
       <w:r>
-        <w:t xml:space="preserve">  050010007609800380326901980040 — </w:t>
+        <w:t xml:space="preserve"> 050010007609800380326901980040. </w:t>
       </w:r>
       <w:r>
         <w:rPr>
@@ -391,12 +336,7 @@
         <w:t>No. 4502 del 29 de noviembre de 2016</w:t>
       </w:r>
       <w:r>
-        <w:t>,</w:t>
-      </w:r>
-    </w:p>
-    <w:p>
-      <w:r>
-        <w:t xml:space="preserve">  Notaría Cuarta de Medellín, debidamente registrada.</w:t>
+        <w:t>, Notaría Cuarta de Medellín, debidamente registrada.</w:t>
       </w:r>
     </w:p>
     <w:p>
@@ -419,26 +359,7 @@
         <w:t>Norte</w:t>
       </w:r>
       <w:r>
-        <w:t>, en línea recta, con muro de cierre de</w:t>
-      </w:r>
-    </w:p>
-    <w:p>
-      <w:r>
-        <w:t xml:space="preserve">  fachada que lo separa de la zona común de circulación del edificio, entre los puntos</w:t>
-      </w:r>
-    </w:p>
-    <w:p>
-      <w:r>
-        <w:t xml:space="preserve">  3 al 4, longitud aprox. </w:t>
-      </w:r>
-      <w:r>
-        <w:rPr>
-          <w:b/>
-        </w:rPr>
-        <w:t>9,55 m</w:t>
-      </w:r>
-      <w:r>
-        <w:t xml:space="preserve">; por el </w:t>
+        <w:t xml:space="preserve">, en línea recta, con muro de cierre de fachada que lo separa de la zona común de circulación del edificio, entre los puntos 3 al 4, longitud aprox. 9,55 m; por el </w:t>
       </w:r>
       <w:r>
         <w:rPr>
@@ -447,26 +368,7 @@
         <w:t>Sur</w:t>
       </w:r>
       <w:r>
-        <w:t>, en línea recta con muro de cierre</w:t>
-      </w:r>
-    </w:p>
-    <w:p>
-      <w:r>
-        <w:t xml:space="preserve">  de fachada externo, entre los puntos 5 al 6, longitud aprox. </w:t>
-      </w:r>
-      <w:r>
-        <w:rPr>
-          <w:b/>
-        </w:rPr>
-        <w:t>11,85 m</w:t>
-      </w:r>
-      <w:r>
-        <w:t>; por el</w:t>
-      </w:r>
-    </w:p>
-    <w:p>
-      <w:r>
-        <w:t xml:space="preserve">  </w:t>
+        <w:t xml:space="preserve">, en línea recta con muro de cierre de fachada externo, entre los puntos 5 al 6, longitud aprox. 11,85 m; por el </w:t>
       </w:r>
       <w:r>
         <w:rPr>
@@ -475,26 +377,7 @@
         <w:t>Oriente</w:t>
       </w:r>
       <w:r>
-        <w:t>, en línea recta, con muro de cierre de fachada que lo separa en parte de</w:t>
-      </w:r>
-    </w:p>
-    <w:p>
-      <w:r>
-        <w:t xml:space="preserve">  la zona común de circulación del edificio y vacío interior, entre los puntos 4 al 5,</w:t>
-      </w:r>
-    </w:p>
-    <w:p>
-      <w:r>
-        <w:t xml:space="preserve">  longitud aprox. </w:t>
-      </w:r>
-      <w:r>
-        <w:rPr>
-          <w:b/>
-        </w:rPr>
-        <w:t>4,40 m</w:t>
-      </w:r>
-      <w:r>
-        <w:t xml:space="preserve">; por el </w:t>
+        <w:t xml:space="preserve">, en línea recta, con muro de cierre de fachada que lo separa en parte de la zona común de circulación del edificio y vacío interior, entre los puntos 4 al 5, longitud aprox. 4,40 m; por el </w:t>
       </w:r>
       <w:r>
         <w:rPr>
@@ -503,40 +386,7 @@
         <w:t>Occidente</w:t>
       </w:r>
       <w:r>
-        <w:t>, en línea recta, en parte con muro</w:t>
-      </w:r>
-    </w:p>
-    <w:p>
-      <w:r>
-        <w:t xml:space="preserve">  medianero que lo separa del Apartamento No. 9839 del piso -2 de la Torre 7, entre los</w:t>
-      </w:r>
-    </w:p>
-    <w:p>
-      <w:r>
-        <w:t xml:space="preserve">  puntos 6 y 1, longitud aprox. </w:t>
-      </w:r>
-      <w:r>
-        <w:rPr>
-          <w:b/>
-        </w:rPr>
-        <w:t>3,90 m</w:t>
-      </w:r>
-      <w:r>
-        <w:t>, y en parte en línea quebrada con buitrón</w:t>
-      </w:r>
-    </w:p>
-    <w:p>
-      <w:r>
-        <w:t xml:space="preserve">  entre los puntos 1, 2 y 3, longitud aprox. </w:t>
-      </w:r>
-      <w:r>
-        <w:rPr>
-          <w:b/>
-        </w:rPr>
-        <w:t>1,20 m</w:t>
-      </w:r>
-      <w:r>
-        <w:t xml:space="preserve">; por el </w:t>
+        <w:t xml:space="preserve">, en línea recta, en parte con muro medianero que lo separa del Apartamento No. 9839 del piso -2 de la Torre 7, entre los puntos 6 y 1, longitud aprox. 3,90 m, y en parte en línea quebrada con buitrón entre los puntos 1, 2 y 3, longitud aprox. 1,20 m; por el </w:t>
       </w:r>
       <w:r>
         <w:rPr>
@@ -545,12 +395,7 @@
         <w:t>Cenit</w:t>
       </w:r>
       <w:r>
-        <w:t>, con losa que</w:t>
-      </w:r>
-    </w:p>
-    <w:p>
-      <w:r>
-        <w:t xml:space="preserve">  lo separa del Apartamento No. 9940 del piso -1 de la Torre 7; por el </w:t>
+        <w:t xml:space="preserve">, con losa que lo separa del Apartamento No. 9940 del piso -1 de la Torre 7; por el </w:t>
       </w:r>
       <w:r>
         <w:rPr>
@@ -559,12 +404,7 @@
         <w:t>Nadir</w:t>
       </w:r>
       <w:r>
-        <w:t>, con</w:t>
-      </w:r>
-    </w:p>
-    <w:p>
-      <w:r>
-        <w:t xml:space="preserve">  losa que lo separa del Apartamento No. 9740 de la Torre 7.</w:t>
+        <w:t>, con losa que lo separa del Apartamento No. 9740 de la Torre 7.</w:t>
       </w:r>
     </w:p>
     <w:p>
@@ -589,17 +429,16 @@
         <w:t>SEGUNDA. OBJETO — CESIÓN.</w:t>
       </w:r>
       <w:r>
-        <w:t xml:space="preserve"> EL CEDENTE **cede la totalidad de su posición</w:t>
+        <w:t xml:space="preserve"> EL CEDENTE </w:t>
       </w:r>
-    </w:p>
-    <w:p>
       <w:r>
-        <w:t>contractual** (derechos y obligaciones) en la referida promesa a favor de EL</w:t>
+        <w:rPr>
+          <w:b/>
+        </w:rPr>
+        <w:t>cede la totalidad de su posición contractual</w:t>
       </w:r>
-    </w:p>
-    <w:p>
       <w:r>
-        <w:t xml:space="preserve">CESIONARIO, quien la acepta y se </w:t>
+        <w:t xml:space="preserve"> (derechos y obligaciones) en la referida promesa a favor de EL CESIONARIO, quien la acepta y se </w:t>
       </w:r>
       <w:r>
         <w:rPr>
@@ -608,17 +447,16 @@
         <w:t>subroga</w:t>
       </w:r>
       <w:r>
-        <w:t xml:space="preserve"> en todos los derechos y obligaciones del</w:t>
+        <w:t xml:space="preserve"> en todos los derechos y obligaciones del promitente comprador. En consecuencia, la </w:t>
       </w:r>
-    </w:p>
-    <w:p>
       <w:r>
-        <w:t>promitente comprador. En consecuencia, la **escritura pública de compraventa se</w:t>
+        <w:rPr>
+          <w:b/>
+        </w:rPr>
+        <w:t>escritura pública de compraventa se otorgará directamente</w:t>
       </w:r>
-    </w:p>
-    <w:p>
       <w:r>
-        <w:t>otorgará directamente** por los vendedores a favor de EL CESIONARIO.</w:t>
+        <w:t xml:space="preserve"> por los vendedores a favor de EL CESIONARIO.</w:t>
       </w:r>
     </w:p>
     <w:p>
@@ -629,17 +467,16 @@
         <w:t>TERCERA. PRECIO DE LA CESIÓN Y FORMA DE PAGO.</w:t>
       </w:r>
       <w:r>
-        <w:t xml:space="preserve"> EL CESIONARIO pagará a EL CEDENTE,</w:t>
+        <w:t xml:space="preserve"> EL CESIONARIO pagará a EL CEDENTE, por esta cesión, la suma de </w:t>
       </w:r>
-    </w:p>
-    <w:p>
       <w:r>
-        <w:t>por esta cesión, la suma de **CIENTO CINCUENTA Y CINCO MILLONES DE PESOS M/CTE</w:t>
+        <w:rPr>
+          <w:b/>
+        </w:rPr>
+        <w:t>CIENTO CINCUENTA Y CINCO MILLONES DE PESOS M/CTE ($155.000.000)</w:t>
       </w:r>
-    </w:p>
-    <w:p>
       <w:r>
-        <w:t>($155.000.000)**, que se cancelará así:</w:t>
+        <w:t>, que se cancelará así:</w:t>
       </w:r>
     </w:p>
     <w:p>
@@ -662,12 +499,7 @@
         <w:t>arras confirmatorias imputables al precio</w:t>
       </w:r>
       <w:r>
-        <w:t xml:space="preserve"> (ver</w:t>
-      </w:r>
-    </w:p>
-    <w:p>
-      <w:r>
-        <w:t xml:space="preserve">   cláusula CUARTA), a la </w:t>
+        <w:t xml:space="preserve"> (ver cláusula CUARTA), a la </w:t>
       </w:r>
       <w:r>
         <w:rPr>
@@ -693,12 +525,7 @@
         <w:t>primer 50% — $67.500.000</w:t>
       </w:r>
       <w:r>
-        <w:t xml:space="preserve"> M/CTE (para un acumulado de</w:t>
-      </w:r>
-    </w:p>
-    <w:p>
-      <w:r>
-        <w:t xml:space="preserve">   </w:t>
+        <w:t xml:space="preserve"> M/CTE (para un acumulado de </w:t>
       </w:r>
       <w:r>
         <w:rPr>
@@ -738,10 +565,8 @@
         </w:rPr>
         <w:t>día de la firma de la Escritura Pública</w:t>
       </w:r>
-    </w:p>
-    <w:p>
       <w:r>
-        <w:t xml:space="preserve">   de compraventa, previsto para el </w:t>
+        <w:t xml:space="preserve"> de compraventa, previsto para el </w:t>
       </w:r>
       <w:r>
         <w:rPr>
@@ -764,17 +589,16 @@
         <w:t>transferencia o consignación</w:t>
       </w:r>
       <w:r>
-        <w:t xml:space="preserve"> a la cuenta que</w:t>
+        <w:t xml:space="preserve"> a la cuenta que indique EL CEDENTE (no en efectivo), para efectos de trazabilidad y del </w:t>
       </w:r>
-    </w:p>
-    <w:p>
       <w:r>
-        <w:t>indique EL CEDENTE (no en efectivo), para efectos de trazabilidad y del **Art. 771-5</w:t>
+        <w:rPr>
+          <w:b/>
+        </w:rPr>
+        <w:t>Art. 771-5 E.T.</w:t>
       </w:r>
-    </w:p>
-    <w:p>
       <w:r>
-        <w:t>E.T.** (bancarización).</w:t>
+        <w:t xml:space="preserve"> (bancarización).</w:t>
       </w:r>
     </w:p>
     <w:p>
@@ -785,40 +609,34 @@
         <w:t>CUARTA. ARRAS.</w:t>
       </w:r>
       <w:r>
-        <w:t xml:space="preserve"> Los $10.000.000 se entregan como **arras confirmatorias imputables</w:t>
-      </w:r>
-    </w:p>
-    <w:p>
-      <w:r>
-        <w:t>al precio</w:t>
+        <w:t xml:space="preserve"> Los $10.000.000 se entregan como </w:t>
       </w:r>
       <w:r>
         <w:rPr>
           <w:b/>
         </w:rPr>
-        <w:t xml:space="preserve">. Si EL CESIONARIO </w:t>
+        <w:t>arras confirmatorias imputables al precio</w:t>
       </w:r>
       <w:r>
-        <w:t>desiste o incumple</w:t>
+        <w:t xml:space="preserve">. Si EL CESIONARIO </w:t>
       </w:r>
       <w:r>
         <w:rPr>
           <w:b/>
         </w:rPr>
+        <w:t>desiste o incumple</w:t>
+      </w:r>
+      <w:r>
         <w:t xml:space="preserve"> sus obligaciones de pago, </w:t>
       </w:r>
       <w:r>
-        <w:t>EL</w:t>
+        <w:rPr>
+          <w:b/>
+        </w:rPr>
+        <w:t>EL CEDENTE podrá retenerlas</w:t>
       </w:r>
-    </w:p>
-    <w:p>
       <w:r>
-        <w:t>CEDENTE podrá retenerlas** a título de parte de la pena (cláusula SEXTA), sin perjuicio</w:t>
-      </w:r>
-    </w:p>
-    <w:p>
-      <w:r>
-        <w:t xml:space="preserve">de las demás acciones. Si el negocio no se realiza por </w:t>
+        <w:t xml:space="preserve"> a título de parte de la pena (cláusula SEXTA), sin perjuicio de las demás acciones. Si el negocio no se realiza por </w:t>
       </w:r>
       <w:r>
         <w:rPr>
@@ -827,12 +645,7 @@
         <w:t>causa imputable a EL CEDENTE</w:t>
       </w:r>
       <w:r>
-        <w:t>,</w:t>
-      </w:r>
-    </w:p>
-    <w:p>
-      <w:r>
-        <w:t xml:space="preserve">este las </w:t>
+        <w:t xml:space="preserve">, este las </w:t>
       </w:r>
       <w:r>
         <w:rPr>
@@ -849,129 +662,46 @@
         <w:rPr>
           <w:b/>
         </w:rPr>
-        <w:t>QUINTA. ESTADO DEL PRECIO DE LA PROMESA Y PRECIO DE LA ESCRITURA.</w:t>
+        <w:t>QUINTA. ESTADO DEL PRECIO.</w:t>
       </w:r>
       <w:r>
-        <w:t xml:space="preserve"> Las partes dejan</w:t>
-      </w:r>
-    </w:p>
-    <w:p>
-      <w:r>
-        <w:t>constancia de que EL CEDENTE **ya pagó en su totalidad a los vendedores el precio de la</w:t>
-      </w:r>
-    </w:p>
-    <w:p>
-      <w:r>
-        <w:t>promesa ($120.000.000)</w:t>
+        <w:t xml:space="preserve"> EL CEDENTE pagó ya a los vendedores la </w:t>
       </w:r>
       <w:r>
         <w:rPr>
           <w:b/>
         </w:rPr>
-        <w:t xml:space="preserve">, por lo que </w:t>
+        <w:t>totalidad del precio de la promesa</w:t>
       </w:r>
       <w:r>
-        <w:t>no queda saldo pendiente a favor de los</w:t>
-      </w:r>
-    </w:p>
-    <w:p>
-      <w:r>
-        <w:t>vendedores**. En consecuencia:</w:t>
-      </w:r>
-    </w:p>
-    <w:p>
-      <w:pPr>
-        <w:pStyle w:val="ListBullet"/>
-      </w:pPr>
-      <w:r>
-        <w:t xml:space="preserve">La </w:t>
+        <w:t xml:space="preserve">, por lo que no queda saldo a su favor. En consecuencia, la escritura se otorgará declarándose el precio </w:t>
       </w:r>
       <w:r>
         <w:rPr>
           <w:b/>
         </w:rPr>
-        <w:t>Escritura Pública de compraventa (vendedores → EL CESIONARIO)</w:t>
+        <w:t>pagado con anterioridad</w:t>
       </w:r>
       <w:r>
-        <w:t xml:space="preserve"> se otorgará por</w:t>
-      </w:r>
-    </w:p>
-    <w:p>
-      <w:r>
-        <w:t xml:space="preserve">  el </w:t>
+        <w:t xml:space="preserve"> por conducto de EL CEDENTE, y </w:t>
       </w:r>
       <w:r>
         <w:rPr>
           <w:b/>
         </w:rPr>
-        <w:t>precio de la promesa, $120.000.000</w:t>
+        <w:t>EL CESIONARIO no deberá suma alguna a los vendedores</w:t>
       </w:r>
       <w:r>
-        <w:t>, que se declarará **pagado en su totalidad</w:t>
-      </w:r>
-    </w:p>
-    <w:p>
-      <w:r>
-        <w:t xml:space="preserve">  con anterioridad** por conducto de EL CEDENTE (promitente comprador original).</w:t>
-      </w:r>
-    </w:p>
-    <w:p>
-      <w:pPr>
-        <w:pStyle w:val="ListBullet"/>
-      </w:pPr>
-      <w:r>
-        <w:t xml:space="preserve">El </w:t>
+        <w:t xml:space="preserve"> en la notaría; su único pago es el </w:t>
       </w:r>
       <w:r>
         <w:rPr>
           <w:b/>
         </w:rPr>
-        <w:t>precio de la cesión ($155.000.000)</w:t>
+        <w:t>precio de la cesión</w:t>
       </w:r>
       <w:r>
-        <w:t xml:space="preserve"> de la cláusula TERCERA, que paga EL</w:t>
-      </w:r>
-    </w:p>
-    <w:p>
-      <w:r>
-        <w:t xml:space="preserve">  CESIONARIO a EL CEDENTE, </w:t>
-      </w:r>
-      <w:r>
-        <w:rPr>
-          <w:b/>
-        </w:rPr>
-        <w:t>comprende el reembolso de los $120.000.000</w:t>
-      </w:r>
-      <w:r>
-        <w:t xml:space="preserve"> que EL CEDENTE</w:t>
-      </w:r>
-    </w:p>
-    <w:p>
-      <w:r>
-        <w:t xml:space="preserve">  pagó a los vendedores </w:t>
-      </w:r>
-      <w:r>
-        <w:rPr>
-          <w:b/>
-        </w:rPr>
-        <w:t>más su margen ($35.000.000)</w:t>
-      </w:r>
-      <w:r>
-        <w:t>, el cual constituye **ingreso</w:t>
-      </w:r>
-    </w:p>
-    <w:p>
-      <w:r>
-        <w:t xml:space="preserve">  gravado de EL CEDENTE</w:t>
-      </w:r>
-      <w:r>
-        <w:rPr>
-          <w:b/>
-        </w:rPr>
-        <w:t xml:space="preserve"> y queda así </w:t>
-      </w:r>
-      <w:r>
-        <w:t>plenamente documentado**.</w:t>
+        <w:t xml:space="preserve"> (cláusula TERCERA) a favor de EL CEDENTE.</w:t>
       </w:r>
     </w:p>
     <w:p>
@@ -982,12 +712,7 @@
         <w:t>SEXTA. CLÁUSULA PENAL.</w:t>
       </w:r>
       <w:r>
-        <w:t xml:space="preserve"> La parte que incumpla cualquiera de las obligaciones aquí</w:t>
-      </w:r>
-    </w:p>
-    <w:p>
-      <w:r>
-        <w:t xml:space="preserve">pactadas pagará a la otra, a título de </w:t>
+        <w:t xml:space="preserve"> La parte que incumpla cualquiera de las obligaciones aquí pactadas pagará a la otra, a título de </w:t>
       </w:r>
       <w:r>
         <w:rPr>
@@ -996,22 +721,16 @@
         <w:t>pena</w:t>
       </w:r>
       <w:r>
-        <w:t>, una suma equivalente al **quince por</w:t>
+        <w:t xml:space="preserve">, una suma equivalente al </w:t>
       </w:r>
-    </w:p>
-    <w:p>
       <w:r>
-        <w:t>ciento (15%) del precio de la cesión — $23.250.000**, como estimación anticipada de</w:t>
+        <w:rPr>
+          <w:b/>
+        </w:rPr>
+        <w:t>quince por ciento (15%) del precio de la cesión — $23.250.000</w:t>
       </w:r>
-    </w:p>
-    <w:p>
       <w:r>
-        <w:t>perjuicios, exigible por vía ejecutiva sin constitución en mora ni requerimiento.</w:t>
-      </w:r>
-    </w:p>
-    <w:p>
-      <w:r>
-        <w:t xml:space="preserve">Conforme al </w:t>
+        <w:t xml:space="preserve">, como estimación anticipada de perjuicios, exigible por vía ejecutiva sin constitución en mora ni requerimiento. Conforme al </w:t>
       </w:r>
       <w:r>
         <w:rPr>
@@ -1020,40 +739,34 @@
         <w:t>Art. 1594 C.C.</w:t>
       </w:r>
       <w:r>
-        <w:t>, EL CEDENTE podrá, a su elección, **exigir el</w:t>
-      </w:r>
-    </w:p>
-    <w:p>
-      <w:r>
-        <w:t>cumplimiento</w:t>
+        <w:t xml:space="preserve">, EL CEDENTE podrá, a su elección, </w:t>
       </w:r>
       <w:r>
         <w:rPr>
           <w:b/>
         </w:rPr>
-        <w:t xml:space="preserve"> del contrato </w:t>
+        <w:t>exigir el cumplimiento</w:t>
       </w:r>
       <w:r>
-        <w:t>o</w:t>
+        <w:t xml:space="preserve"> del contrato </w:t>
       </w:r>
       <w:r>
         <w:rPr>
           <w:b/>
         </w:rPr>
+        <w:t>o</w:t>
+      </w:r>
+      <w:r>
         <w:t xml:space="preserve"> la pena, y en todo caso esta </w:t>
       </w:r>
       <w:r>
-        <w:t>no extingue** la</w:t>
+        <w:rPr>
+          <w:b/>
+        </w:rPr>
+        <w:t>no extingue</w:t>
       </w:r>
-    </w:p>
-    <w:p>
       <w:r>
-        <w:t>obligación principal cuando se exija el cumplimiento. Las arras retenidas (cláusula</w:t>
-      </w:r>
-    </w:p>
-    <w:p>
-      <w:r>
-        <w:t xml:space="preserve">CUARTA) se </w:t>
+        <w:t xml:space="preserve"> la obligación principal cuando se exija el cumplimiento. Las arras retenidas (cláusula CUARTA) se </w:t>
       </w:r>
       <w:r>
         <w:rPr>
@@ -1082,17 +795,7 @@
         <w:t>no paga</w:t>
       </w:r>
       <w:r>
-        <w:t xml:space="preserve"> el</w:t>
-      </w:r>
-    </w:p>
-    <w:p>
-      <w:r>
-        <w:t>saldo del primer 50% (3 de noviembre) o el 50% final (a la escritura), EL CEDENTE</w:t>
-      </w:r>
-    </w:p>
-    <w:p>
-      <w:r>
-        <w:t xml:space="preserve">podrá, a su arbitrio, </w:t>
+        <w:t xml:space="preserve"> el saldo del primer 50% (3 de noviembre) o el 50% final (a la escritura), EL CEDENTE podrá, a su arbitrio, </w:t>
       </w:r>
       <w:r>
         <w:rPr>
@@ -1101,17 +804,16 @@
         <w:t>declarar resuelta</w:t>
       </w:r>
       <w:r>
-        <w:t xml:space="preserve"> la cesión y **recuperar su posición</w:t>
+        <w:t xml:space="preserve"> la cesión y </w:t>
       </w:r>
-    </w:p>
-    <w:p>
       <w:r>
-        <w:t>contractual** como promitente comprador, reteniendo las arras y exigiendo la cláusula</w:t>
+        <w:rPr>
+          <w:b/>
+        </w:rPr>
+        <w:t>recuperar su posición contractual</w:t>
       </w:r>
-    </w:p>
-    <w:p>
       <w:r>
-        <w:t>penal, sin necesidad de requerimiento judicial previo, al que las partes renuncian.</w:t>
+        <w:t xml:space="preserve"> como promitente comprador, reteniendo las arras y exigiendo la cláusula penal, sin necesidad de requerimiento judicial previo, al que las partes renuncian.</w:t>
       </w:r>
     </w:p>
     <w:p>
@@ -1131,29 +833,26 @@
         <w:t>retiro de ISVIMED</w:t>
       </w:r>
       <w:r>
-        <w:t xml:space="preserve"> (prohibición de</w:t>
-      </w:r>
-    </w:p>
-    <w:p>
-      <w:r>
-        <w:t>transferencia y derecho de preferencia, Ley 1537 de 2012) **ya se encuentra</w:t>
-      </w:r>
-    </w:p>
-    <w:p>
-      <w:r>
-        <w:t>registrado</w:t>
+        <w:t xml:space="preserve"> (prohibición de transferencia y derecho de preferencia, Ley 1537 de 2012) </w:t>
       </w:r>
       <w:r>
         <w:rPr>
           <w:b/>
         </w:rPr>
+        <w:t>ya se encuentra registrado</w:t>
+      </w:r>
+      <w:r>
         <w:t xml:space="preserve">, por lo que esa limitación está </w:t>
       </w:r>
       <w:r>
-        <w:t>saneada**. Restan únicamente la</w:t>
+        <w:rPr>
+          <w:b/>
+        </w:rPr>
+        <w:t>saneada</w:t>
       </w:r>
-    </w:p>
-    <w:p>
+      <w:r>
+        <w:t xml:space="preserve">. Restan únicamente la </w:t>
+      </w:r>
       <w:r>
         <w:rPr>
           <w:b/>
@@ -1161,40 +860,34 @@
         <w:t>cancelación del Patrimonio de Familia</w:t>
       </w:r>
       <w:r>
-        <w:t xml:space="preserve"> y el **levantamiento de la Afectación a</w:t>
-      </w:r>
-    </w:p>
-    <w:p>
-      <w:r>
-        <w:t>Vivienda Familiar</w:t>
+        <w:t xml:space="preserve"> y el </w:t>
       </w:r>
       <w:r>
         <w:rPr>
           <w:b/>
         </w:rPr>
-        <w:t xml:space="preserve">, los cuales se otorgarán </w:t>
+        <w:t>levantamiento de la Afectación a Vivienda Familiar</w:t>
       </w:r>
       <w:r>
-        <w:t>simultáneamente, en el mismo acto de la</w:t>
-      </w:r>
-    </w:p>
-    <w:p>
-      <w:r>
-        <w:t>Escritura Pública de compraventa</w:t>
+        <w:t xml:space="preserve">, los cuales se otorgarán </w:t>
       </w:r>
       <w:r>
         <w:rPr>
           <w:b/>
         </w:rPr>
+        <w:t>simultáneamente, en el mismo acto de la Escritura Pública de compraventa</w:t>
+      </w:r>
+      <w:r>
         <w:t xml:space="preserve"> (cláusula NOVENA). La </w:t>
       </w:r>
       <w:r>
-        <w:t>gestión y los costos** de</w:t>
+        <w:rPr>
+          <w:b/>
+        </w:rPr>
+        <w:t>gestión y los costos</w:t>
       </w:r>
-    </w:p>
-    <w:p>
       <w:r>
-        <w:t xml:space="preserve">ambos trámites serán </w:t>
+        <w:t xml:space="preserve"> de ambos trámites serán </w:t>
       </w:r>
       <w:r>
         <w:rPr>
@@ -1203,10 +896,8 @@
         <w:t>asumidos por EL CEDENTE (Nicolás)</w:t>
       </w:r>
       <w:r>
-        <w:t>, sin perjuicio de la</w:t>
+        <w:t xml:space="preserve">, sin perjuicio de la </w:t>
       </w:r>
-    </w:p>
-    <w:p>
       <w:r>
         <w:rPr>
           <w:b/>
@@ -1214,12 +905,7 @@
         <w:t>comparecencia</w:t>
       </w:r>
       <w:r>
-        <w:t xml:space="preserve"> que deban hacer en la escritura los vendedores (Martha y Luis</w:t>
-      </w:r>
-    </w:p>
-    <w:p>
-      <w:r>
-        <w:t>Eduardo) y las demás personas que la ley exija.</w:t>
+        <w:t xml:space="preserve"> que deban hacer en la escritura los vendedores (Martha y Luis Eduardo) y las demás personas que la ley exija.</w:t>
       </w:r>
     </w:p>
     <w:p>
@@ -1230,12 +916,7 @@
         <w:t>NOVENA. ESCRITURACIÓN.</w:t>
       </w:r>
       <w:r>
-        <w:t xml:space="preserve"> La escritura pública de compraventa se otorgará a favor de</w:t>
-      </w:r>
-    </w:p>
-    <w:p>
-      <w:r>
-        <w:t xml:space="preserve">EL CESIONARIO en la </w:t>
+        <w:t xml:space="preserve"> La escritura pública de compraventa se otorgará a favor de EL CESIONARIO en la </w:t>
       </w:r>
       <w:r>
         <w:rPr>
@@ -1244,31 +925,25 @@
         <w:t>Notaría Cuarta (4ª) del Círculo de Medellín</w:t>
       </w:r>
       <w:r>
-        <w:t>, el día **12 de</w:t>
-      </w:r>
-    </w:p>
-    <w:p>
-      <w:r>
-        <w:t>noviembre de 2026 a las 10:00 a.m.</w:t>
+        <w:t xml:space="preserve">, el día </w:t>
       </w:r>
       <w:r>
         <w:rPr>
           <w:b/>
         </w:rPr>
+        <w:t>12 de noviembre de 2026 a las 10:00 a.m.</w:t>
+      </w:r>
+      <w:r>
         <w:t xml:space="preserve"> El </w:t>
       </w:r>
       <w:r>
-        <w:t>pago del 50% final es simultáneo** con la</w:t>
+        <w:rPr>
+          <w:b/>
+        </w:rPr>
+        <w:t>pago del 50% final es simultáneo</w:t>
       </w:r>
-    </w:p>
-    <w:p>
       <w:r>
-        <w:t>firma de la escritura (EL CESIONARIO no recibe el título sin pagar, ni EL CEDENTE/los</w:t>
-      </w:r>
-    </w:p>
-    <w:p>
-      <w:r>
-        <w:t>vendedores escrituran sin recibir el saldo).</w:t>
+        <w:t xml:space="preserve"> con la firma de la escritura (EL CESIONARIO no recibe el título sin pagar, ni EL CEDENTE/los vendedores escrituran sin recibir el saldo).</w:t>
       </w:r>
     </w:p>
     <w:p>
@@ -1282,36 +957,25 @@
         <w:t>mismo acto</w:t>
       </w:r>
       <w:r>
-        <w:t xml:space="preserve"> de esta Escritura Pública se otorgarán la **cancelación</w:t>
-      </w:r>
-    </w:p>
-    <w:p>
-      <w:r>
-        <w:t>del Patrimonio de Familia</w:t>
+        <w:t xml:space="preserve"> de esta Escritura Pública se otorgarán la </w:t>
       </w:r>
       <w:r>
         <w:rPr>
           <w:b/>
         </w:rPr>
+        <w:t>cancelación del Patrimonio de Familia</w:t>
+      </w:r>
+      <w:r>
         <w:t xml:space="preserve"> y el </w:t>
       </w:r>
       <w:r>
-        <w:t>levantamiento de la Afectación a Vivienda Familiar**</w:t>
+        <w:rPr>
+          <w:b/>
+        </w:rPr>
+        <w:t>levantamiento de la Afectación a Vivienda Familiar</w:t>
       </w:r>
-    </w:p>
-    <w:p>
       <w:r>
-        <w:t>(cláusula OCTAVA), de modo que, con el registro de la escritura, el inmueble quede libre</w:t>
-      </w:r>
-    </w:p>
-    <w:p>
-      <w:r>
-        <w:t>de toda limitación. Si por algún trámite pendiente no fuere posible escriturar en la</w:t>
-      </w:r>
-    </w:p>
-    <w:p>
-      <w:r>
-        <w:t xml:space="preserve">fecha prevista, las partes la </w:t>
+        <w:t xml:space="preserve"> (cláusula OCTAVA), de modo que, con el registro de la escritura, el inmueble quede libre de toda limitación. Si por algún trámite pendiente no fuere posible escriturar en la fecha prevista, las partes la </w:t>
       </w:r>
       <w:r>
         <w:rPr>
@@ -1320,17 +984,7 @@
         <w:t>prorrogarán</w:t>
       </w:r>
       <w:r>
-        <w:t xml:space="preserve"> de común acuerdo mediante otrosí,</w:t>
-      </w:r>
-    </w:p>
-    <w:p>
-      <w:r>
-        <w:t>manteniéndose el precio, las arras y los pagos ya efectuados; el 50% final se pagará el</w:t>
-      </w:r>
-    </w:p>
-    <w:p>
-      <w:r>
-        <w:t>día de la escritura efectivamente otorgada.</w:t>
+        <w:t xml:space="preserve"> de común acuerdo mediante otrosí, manteniéndose el precio, las arras y los pagos ya efectuados; el 50% final se pagará el día de la escritura efectivamente otorgada.</w:t>
       </w:r>
     </w:p>
     <w:p>
@@ -1341,31 +995,16 @@
         <w:t>DÉCIMA. ENTREGA MATERIAL.</w:t>
       </w:r>
       <w:r>
-        <w:t xml:space="preserve"> La entrega material del inmueble, a paz y salvo por</w:t>
-      </w:r>
-    </w:p>
-    <w:p>
-      <w:r>
-        <w:t>servicios públicos, administración y predial, se hará **una vez pagado la totalidad del</w:t>
-      </w:r>
-    </w:p>
-    <w:p>
-      <w:r>
-        <w:t>precio de la cesión y otorgada la escritura</w:t>
+        <w:t xml:space="preserve"> La entrega material del inmueble, a paz y salvo por servicios públicos, administración y predial, se hará </w:t>
       </w:r>
       <w:r>
         <w:rPr>
           <w:b/>
         </w:rPr>
-        <w:t xml:space="preserve"> </w:t>
+        <w:t>una vez pagado la totalidad del precio de la cesión y otorgada la escritura</w:t>
       </w:r>
       <w:r>
-        <w:t>[o dentro de los [__] días</w:t>
-      </w:r>
-    </w:p>
-    <w:p>
-      <w:r>
-        <w:t>siguientes]**.</w:t>
+        <w:t>.</w:t>
       </w:r>
     </w:p>
     <w:p>
@@ -1376,17 +1015,16 @@
         <w:t>DÉCIMA PRIMERA. DECLARACIONES DEL CESIONARIO.</w:t>
       </w:r>
       <w:r>
-        <w:t xml:space="preserve"> EL CESIONARIO declara que **conoce y</w:t>
+        <w:t xml:space="preserve"> EL CESIONARIO declara que </w:t>
       </w:r>
-    </w:p>
-    <w:p>
       <w:r>
-        <w:t>acepta** íntegramente la promesa del 21 de agosto de 2026 y su otrosí, el estado del</w:t>
+        <w:rPr>
+          <w:b/>
+        </w:rPr>
+        <w:t>conoce y acepta</w:t>
       </w:r>
-    </w:p>
-    <w:p>
       <w:r>
-        <w:t xml:space="preserve">folio de matrícula 01N-5433420, las </w:t>
+        <w:t xml:space="preserve"> íntegramente la promesa del 21 de agosto de 2026 y su otrosí, el estado del folio de matrícula 01N-5433420, las </w:t>
       </w:r>
       <w:r>
         <w:rPr>
@@ -1395,17 +1033,7 @@
         <w:t>limitaciones vigentes</w:t>
       </w:r>
       <w:r>
-        <w:t xml:space="preserve"> y el trámite de</w:t>
-      </w:r>
-    </w:p>
-    <w:p>
-      <w:r>
-        <w:t>saneamiento en curso, subrogándose en la posición del promitente comprador en esas</w:t>
-      </w:r>
-    </w:p>
-    <w:p>
-      <w:r>
-        <w:t>condiciones.</w:t>
+        <w:t xml:space="preserve"> y el trámite de saneamiento en curso, subrogándose en la posición del promitente comprador en esas condiciones.</w:t>
       </w:r>
     </w:p>
     <w:p>
@@ -1416,10 +1044,8 @@
         <w:t>DÉCIMA SEGUNDA. DECLARACIONES TRIBUTARIAS.</w:t>
       </w:r>
       <w:r>
-        <w:t xml:space="preserve"> Las partes reconocen el carácter</w:t>
+        <w:t xml:space="preserve"> Las partes reconocen el carácter </w:t>
       </w:r>
-    </w:p>
-    <w:p>
       <w:r>
         <w:rPr>
           <w:b/>
@@ -1427,17 +1053,13 @@
         <w:t>gravado</w:t>
       </w:r>
       <w:r>
-        <w:t xml:space="preserve"> del ingreso que percibe EL CEDENTE por esta cesión (renta ordinaria) y que</w:t>
+        <w:t xml:space="preserve"> del ingreso que percibe EL CEDENTE por esta cesión (renta ordinaria) y que cada una asume sus propias obligaciones tributarias. </w:t>
       </w:r>
-    </w:p>
-    <w:p>
       <w:r>
-        <w:t>cada una asume sus propias obligaciones tributarias. **Ambas declaran que el precio aquí</w:t>
-      </w:r>
-    </w:p>
-    <w:p>
-      <w:r>
-        <w:t>pactado es el real de la operación.**</w:t>
+        <w:rPr>
+          <w:b/>
+        </w:rPr>
+        <w:t>Ambas declaran que el precio aquí pactado es el real de la operación.</w:t>
       </w:r>
     </w:p>
     <w:p>
@@ -1448,26 +1070,25 @@
         <w:t>DÉCIMA TERCERA. MÉRITO EJECUTIVO.</w:t>
       </w:r>
       <w:r>
-        <w:t xml:space="preserve"> Este contrato contiene obligaciones **claras,</w:t>
-      </w:r>
-    </w:p>
-    <w:p>
-      <w:r>
-        <w:t>expresas y exigibles</w:t>
+        <w:t xml:space="preserve"> Este contrato contiene obligaciones </w:t>
       </w:r>
       <w:r>
         <w:rPr>
           <w:b/>
         </w:rPr>
+        <w:t>claras, expresas y exigibles</w:t>
+      </w:r>
+      <w:r>
         <w:t xml:space="preserve"> y presta </w:t>
       </w:r>
       <w:r>
-        <w:t>mérito ejecutivo** (Art. 422 C.G.P.) respecto de los</w:t>
+        <w:rPr>
+          <w:b/>
+        </w:rPr>
+        <w:t>mérito ejecutivo</w:t>
       </w:r>
-    </w:p>
-    <w:p>
       <w:r>
-        <w:t>pagos a cargo de EL CESIONARIO.</w:t>
+        <w:t xml:space="preserve"> (Art. 422 C.G.P.) respecto de los pagos a cargo de EL CESIONARIO.</w:t>
       </w:r>
     </w:p>
     <w:p>
@@ -1497,10 +1118,8 @@
         </w:rPr>
         <w:t>partes iguales</w:t>
       </w:r>
-    </w:p>
-    <w:p>
       <w:r>
-        <w:t xml:space="preserve">  (50% / 50%).</w:t>
+        <w:t xml:space="preserve"> (50% / 50%).</w:t>
       </w:r>
     </w:p>
     <w:p>
@@ -1514,12 +1133,16 @@
         <w:t>Registro e impuesto de registro / beneficencia de la escritura:</w:t>
       </w:r>
       <w:r>
-        <w:t xml:space="preserve"> por **EL</w:t>
+        <w:t xml:space="preserve"> por </w:t>
       </w:r>
-    </w:p>
-    <w:p>
       <w:r>
-        <w:t xml:space="preserve">  CESIONARIO**.</w:t>
+        <w:rPr>
+          <w:b/>
+        </w:rPr>
+        <w:t>EL CESIONARIO</w:t>
+      </w:r>
+      <w:r>
+        <w:t>.</w:t>
       </w:r>
     </w:p>
     <w:p>
@@ -1532,10 +1155,8 @@
         </w:rPr>
         <w:t>Levantamiento del Patrimonio de Familia y de la Afectación a Vivienda Familiar:</w:t>
       </w:r>
-    </w:p>
-    <w:p>
       <w:r>
-        <w:t xml:space="preserve">  por </w:t>
+        <w:t xml:space="preserve"> por </w:t>
       </w:r>
       <w:r>
         <w:rPr>
@@ -1578,17 +1199,7 @@
         <w:t>Medellín</w:t>
       </w:r>
       <w:r>
-        <w:t xml:space="preserve"> y</w:t>
-      </w:r>
-    </w:p>
-    <w:p>
-      <w:r>
-        <w:t>se aplican las leyes colombianas; las controversias se resolverán ante los jueces</w:t>
-      </w:r>
-    </w:p>
-    <w:p>
-      <w:r>
-        <w:t xml:space="preserve">competentes de Medellín, previa </w:t>
+        <w:t xml:space="preserve"> y se aplican las leyes colombianas; las controversias se resolverán ante los jueces competentes de Medellín, previa </w:t>
       </w:r>
       <w:r>
         <w:rPr>
@@ -1620,7 +1231,7 @@
         <w:t>[____]</w:t>
       </w:r>
       <w:r>
-        <w:t xml:space="preserve"> de 2026, en</w:t>
+        <w:t xml:space="preserve"> de 2026, en dos (2) ejemplares de igual tenor.</w:t>
       </w:r>
     </w:p>
     <w:p>
@@ -1628,30 +1239,35 @@
         <w:rPr>
           <w:b/>
         </w:rPr>
-        <w:t>dos (2)</w:t>
-      </w:r>
-      <w:r>
-        <w:t xml:space="preserve"> ejemplares de igual tenor.</w:t>
+        <w:t>EL CEDENTE</w:t>
       </w:r>
     </w:p>
     <w:p>
       <w:r>
-        <w:t>EL CEDENTE                                    EL CESIONARIO</w:t>
+        <w:t>_____________________________</w:t>
       </w:r>
     </w:p>
     <w:p>
       <w:r>
-        <w:t>_____________________________                _____________________________</w:t>
+        <w:t>NICOLÁS MEJÍA ACEVEDO — C.C. 1.028.031.225</w:t>
       </w:r>
     </w:p>
     <w:p>
       <w:r>
-        <w:t>NICOLÁS MEJÍA ACEVEDO                         SIMÓN ANGULO RAMÍREZ</w:t>
+        <w:rPr>
+          <w:b/>
+        </w:rPr>
+        <w:t>EL CESIONARIO</w:t>
       </w:r>
     </w:p>
     <w:p>
       <w:r>
-        <w:t>C.C. 1.028.031.225                            C.C. 1.023.527.392</w:t>
+        <w:t>_____________________________</w:t>
+      </w:r>
+    </w:p>
+    <w:p>
+      <w:r>
+        <w:t>SIMÓN ANGULO RAMÍREZ — C.C. 1.023.527.392</w:t>
       </w:r>
     </w:p>
     <w:sectPr>

</xml_diff>